<commit_message>
CV : deplace liens LinkedIn/Odoo Apps de l'en-tete vers le bas du document
</commit_message>
<xml_diff>
--- a/CV_Farid_SLIMANI_DZ.docx
+++ b/CV_Farid_SLIMANI_DZ.docx
@@ -204,52 +204,6 @@
               <w:t xml:space="preserve"> FR · AR · KAB · EN (notions)</w:t>
             </w:r>
           </w:p>
-          <w:p>
-            <w:r>
-              <w:rPr>
-                <w:color w:val="C8DCF0"/>
-                <w:sz w:val="19"/>
-                <w:szCs w:val="19"/>
-              </w:rPr>
-              <w:t xml:space="preserve">LinkedIn : </w:t>
-            </w:r>
-            <w:hyperlink r:id="rId8">
-              <w:r>
-                <w:rPr>
-                  <w:color w:val="C8DCF0"/>
-                  <w:sz w:val="19"/>
-                  <w:szCs w:val="19"/>
-                </w:rPr>
-                <w:t xml:space="preserve">linkedin.com/in/farid-slimani</w:t>
-              </w:r>
-            </w:hyperlink>
-            <w:r>
-              <w:rPr>
-                <w:color w:val="C8DCF0"/>
-                <w:sz w:val="19"/>
-                <w:szCs w:val="19"/>
-              </w:rPr>
-              <w:t xml:space="preserve">  |  Odoo Apps : </w:t>
-            </w:r>
-            <w:hyperlink r:id="rId9">
-              <w:r>
-                <w:rPr>
-                  <w:color w:val="C8DCF0"/>
-                  <w:sz w:val="19"/>
-                  <w:szCs w:val="19"/>
-                </w:rPr>
-                <w:t xml:space="preserve">apps.odoo.com</w:t>
-              </w:r>
-            </w:hyperlink>
-            <w:r>
-              <w:rPr>
-                <w:color w:val="C8DCF0"/>
-                <w:sz w:val="19"/>
-                <w:szCs w:val="19"/>
-              </w:rPr>
-              <w:t xml:space="preserve"> — 34 modules publiés</w:t>
-            </w:r>
-          </w:p>
         </w:tc>
         <w:tc>
           <w:tcPr>
@@ -3069,6 +3023,52 @@
           <w:szCs w:val="18"/>
         </w:rPr>
         <w:t>–  PFE : Site web de gestion de librairies (PHP, MySQL, HTML/CSS, JS)</w:t>
+      </w:r>
+    </w:p>
+    <w:p>
+      <w:r>
+        <w:rPr>
+          <w:color w:val="C8DCF0"/>
+          <w:sz w:val="19"/>
+          <w:szCs w:val="19"/>
+        </w:rPr>
+        <w:t xml:space="preserve">LinkedIn : </w:t>
+      </w:r>
+      <w:hyperlink r:id="rId8">
+        <w:r>
+          <w:rPr>
+            <w:color w:val="C8DCF0"/>
+            <w:sz w:val="19"/>
+            <w:szCs w:val="19"/>
+          </w:rPr>
+          <w:t xml:space="preserve">linkedin.com/in/farid-slimani</w:t>
+        </w:r>
+      </w:hyperlink>
+      <w:r>
+        <w:rPr>
+          <w:color w:val="C8DCF0"/>
+          <w:sz w:val="19"/>
+          <w:szCs w:val="19"/>
+        </w:rPr>
+        <w:t xml:space="preserve">  |  Odoo Apps : </w:t>
+      </w:r>
+      <w:hyperlink r:id="rId9">
+        <w:r>
+          <w:rPr>
+            <w:color w:val="C8DCF0"/>
+            <w:sz w:val="19"/>
+            <w:szCs w:val="19"/>
+          </w:rPr>
+          <w:t xml:space="preserve">apps.odoo.com</w:t>
+        </w:r>
+      </w:hyperlink>
+      <w:r>
+        <w:rPr>
+          <w:color w:val="C8DCF0"/>
+          <w:sz w:val="19"/>
+          <w:szCs w:val="19"/>
+        </w:rPr>
+        <w:t xml:space="preserve"> — 34 modules publiés</w:t>
       </w:r>
     </w:p>
     <w:sectPr>

</xml_diff>

<commit_message>
CV : regen docx/pdf (liens en bas)
</commit_message>
<xml_diff>
--- a/CV_Farid_SLIMANI_DZ.docx
+++ b/CV_Farid_SLIMANI_DZ.docx
@@ -1,6 +1,6 @@
 
 <file path=word/document.xml><?xml version="1.0" encoding="utf-8"?>
-<w:document xmlns:a="http://schemas.openxmlformats.org/drawingml/2006/main" xmlns:a14="http://schemas.microsoft.com/office/drawing/2010/main" xmlns:mc="http://schemas.openxmlformats.org/markup-compatibility/2006" xmlns:pic="http://schemas.openxmlformats.org/drawingml/2006/picture" xmlns:r="http://schemas.openxmlformats.org/officeDocument/2006/relationships" xmlns:w="http://schemas.openxmlformats.org/wordprocessingml/2006/main" xmlns:w14="http://schemas.microsoft.com/office/word/2010/wordml" xmlns:wp="http://schemas.openxmlformats.org/drawingml/2006/wordprocessingDrawing" xmlns:wp14="http://schemas.microsoft.com/office/word/2010/wordprocessingDrawing" xmlns:wpc="http://schemas.microsoft.com/office/word/2010/wordprocessingCanvas" xmlns:cx="http://schemas.microsoft.com/office/drawing/2014/chartex" xmlns:cx1="http://schemas.microsoft.com/office/drawing/2015/9/8/chartex" xmlns:cx2="http://schemas.microsoft.com/office/drawing/2015/10/21/chartex" xmlns:cx3="http://schemas.microsoft.com/office/drawing/2016/5/9/chartex" xmlns:cx4="http://schemas.microsoft.com/office/drawing/2016/5/10/chartex" xmlns:cx5="http://schemas.microsoft.com/office/drawing/2016/5/11/chartex" xmlns:cx6="http://schemas.microsoft.com/office/drawing/2016/5/12/chartex" xmlns:cx7="http://schemas.microsoft.com/office/drawing/2016/5/13/chartex" xmlns:cx8="http://schemas.microsoft.com/office/drawing/2016/5/14/chartex" xmlns:aink="http://schemas.microsoft.com/office/drawing/2016/ink" xmlns:am3d="http://schemas.microsoft.com/office/drawing/2017/model3d" xmlns:o="urn:schemas-microsoft-com:office:office" xmlns:oel="http://schemas.microsoft.com/office/2019/extlst" xmlns:m="http://schemas.openxmlformats.org/officeDocument/2006/math" xmlns:v="urn:schemas-microsoft-com:vml" xmlns:w10="urn:schemas-microsoft-com:office:word" xmlns:w15="http://schemas.microsoft.com/office/word/2012/wordml" xmlns:w16cex="http://schemas.microsoft.com/office/word/2018/wordml/cex" xmlns:w16cid="http://schemas.microsoft.com/office/word/2016/wordml/cid" xmlns:w16="http://schemas.microsoft.com/office/word/2018/wordml" xmlns:w16du="http://schemas.microsoft.com/office/word/2023/wordml/word16du" xmlns:w16sdtdh="http://schemas.microsoft.com/office/word/2020/wordml/sdtdatahash" xmlns:w16sdtfl="http://schemas.microsoft.com/office/word/2024/wordml/sdtformatlock" xmlns:w16se="http://schemas.microsoft.com/office/word/2015/wordml/symex" xmlns:wpg="http://schemas.microsoft.com/office/word/2010/wordprocessingGroup" xmlns:wpi="http://schemas.microsoft.com/office/word/2010/wordprocessingInk" xmlns:wne="http://schemas.microsoft.com/office/word/2006/wordml" xmlns:wps="http://schemas.microsoft.com/office/word/2010/wordprocessingShape" mc:Ignorable="w14 w15 w16se w16cid w16 w16cex w16sdtdh w16sdtfl w16du wp14">
+<w:document xmlns:wpc="http://schemas.microsoft.com/office/word/2010/wordprocessingCanvas" xmlns:cx="http://schemas.microsoft.com/office/drawing/2014/chartex" xmlns:cx1="http://schemas.microsoft.com/office/drawing/2015/9/8/chartex" xmlns:cx2="http://schemas.microsoft.com/office/drawing/2015/10/21/chartex" xmlns:cx3="http://schemas.microsoft.com/office/drawing/2016/5/9/chartex" xmlns:cx4="http://schemas.microsoft.com/office/drawing/2016/5/10/chartex" xmlns:cx5="http://schemas.microsoft.com/office/drawing/2016/5/11/chartex" xmlns:cx6="http://schemas.microsoft.com/office/drawing/2016/5/12/chartex" xmlns:cx7="http://schemas.microsoft.com/office/drawing/2016/5/13/chartex" xmlns:cx8="http://schemas.microsoft.com/office/drawing/2016/5/14/chartex" xmlns:mc="http://schemas.openxmlformats.org/markup-compatibility/2006" xmlns:aink="http://schemas.microsoft.com/office/drawing/2016/ink" xmlns:am3d="http://schemas.microsoft.com/office/drawing/2017/model3d" xmlns:o="urn:schemas-microsoft-com:office:office" xmlns:oel="http://schemas.microsoft.com/office/2019/extlst" xmlns:r="http://schemas.openxmlformats.org/officeDocument/2006/relationships" xmlns:m="http://schemas.openxmlformats.org/officeDocument/2006/math" xmlns:v="urn:schemas-microsoft-com:vml" xmlns:wp14="http://schemas.microsoft.com/office/word/2010/wordprocessingDrawing" xmlns:wp="http://schemas.openxmlformats.org/drawingml/2006/wordprocessingDrawing" xmlns:w10="urn:schemas-microsoft-com:office:word" xmlns:w="http://schemas.openxmlformats.org/wordprocessingml/2006/main" xmlns:w14="http://schemas.microsoft.com/office/word/2010/wordml" xmlns:w15="http://schemas.microsoft.com/office/word/2012/wordml" xmlns:w16cei="http://schemas.microsoft.com/office/word/2026/wordml/cei" xmlns:w16cex="http://schemas.microsoft.com/office/word/2018/wordml/cex" xmlns:w16cid="http://schemas.microsoft.com/office/word/2016/wordml/cid" xmlns:w16="http://schemas.microsoft.com/office/word/2018/wordml" xmlns:w16du="http://schemas.microsoft.com/office/word/2023/wordml/word16du" xmlns:w16sdtdh="http://schemas.microsoft.com/office/word/2020/wordml/sdtdatahash" xmlns:w16sdtfl="http://schemas.microsoft.com/office/word/2024/wordml/sdtformatlock" xmlns:w16se="http://schemas.microsoft.com/office/word/2015/wordml/symex" xmlns:wpg="http://schemas.microsoft.com/office/word/2010/wordprocessingGroup" xmlns:wpi="http://schemas.microsoft.com/office/word/2010/wordprocessingInk" xmlns:wne="http://schemas.microsoft.com/office/word/2006/wordml" xmlns:wps="http://schemas.microsoft.com/office/word/2010/wordprocessingShape" mc:Ignorable="w14 w15 w16se w16cid w16 w16cex w16sdtdh w16sdtfl w16du wp14">
   <w:body>
     <w:tbl>
       <w:tblPr>
@@ -24,6 +24,9 @@
         <w:gridCol w:w="2380"/>
       </w:tblGrid>
       <w:tr>
+        <w:trPr>
+          <w:trHeight w:val="2577"/>
+        </w:trPr>
         <w:tc>
           <w:tcPr>
             <w:tcW w:w="7560" w:type="dxa"/>
@@ -66,11 +69,30 @@
                 <w:sz w:val="26"/>
                 <w:szCs w:val="26"/>
               </w:rPr>
-              <w:t>Développeur Sénior  &amp;  Consultant ERP ODOO</w:t>
+              <w:t xml:space="preserve">Développeur </w:t>
+            </w:r>
+            <w:proofErr w:type="gramStart"/>
+            <w:r>
+              <w:rPr>
+                <w:color w:val="A8D4F5"/>
+                <w:sz w:val="26"/>
+                <w:szCs w:val="26"/>
+              </w:rPr>
+              <w:t>Sénior  &amp;</w:t>
+            </w:r>
+            <w:proofErr w:type="gramEnd"/>
+            <w:r>
+              <w:rPr>
+                <w:color w:val="A8D4F5"/>
+                <w:sz w:val="26"/>
+                <w:szCs w:val="26"/>
+              </w:rPr>
+              <w:t xml:space="preserve">  Consultant ERP ODOO</w:t>
             </w:r>
           </w:p>
           <w:p>
             <w:pPr>
+              <w:spacing w:line="276" w:lineRule="auto"/>
               <w:rPr>
                 <w:color w:val="C8DCF0"/>
                 <w:sz w:val="19"/>
@@ -92,7 +114,25 @@
                 <w:sz w:val="19"/>
                 <w:szCs w:val="19"/>
               </w:rPr>
-              <w:t xml:space="preserve"> Bordj El Kiffan, Alger</w:t>
+              <w:t xml:space="preserve"> Bordj El </w:t>
+            </w:r>
+            <w:proofErr w:type="spellStart"/>
+            <w:r>
+              <w:rPr>
+                <w:color w:val="C8DCF0"/>
+                <w:sz w:val="19"/>
+                <w:szCs w:val="19"/>
+              </w:rPr>
+              <w:t>Kiffan</w:t>
+            </w:r>
+            <w:proofErr w:type="spellEnd"/>
+            <w:r>
+              <w:rPr>
+                <w:color w:val="C8DCF0"/>
+                <w:sz w:val="19"/>
+                <w:szCs w:val="19"/>
+              </w:rPr>
+              <w:t>, Alger</w:t>
             </w:r>
             <w:r>
               <w:rPr>
@@ -145,6 +185,9 @@
             </w:r>
           </w:p>
           <w:p>
+            <w:pPr>
+              <w:spacing w:line="276" w:lineRule="auto"/>
+            </w:pPr>
             <w:r>
               <w:rPr>
                 <w:rFonts w:ascii="Segoe UI Symbol" w:hAnsi="Segoe UI Symbol" w:cs="Segoe UI Symbol"/>
@@ -162,6 +205,7 @@
               </w:rPr>
               <w:t xml:space="preserve"> </w:t>
             </w:r>
+            <w:proofErr w:type="gramStart"/>
             <w:r>
               <w:rPr>
                 <w:color w:val="C8DCF0"/>
@@ -184,7 +228,16 @@
                 <w:sz w:val="19"/>
                 <w:szCs w:val="19"/>
               </w:rPr>
-              <w:t xml:space="preserve">| </w:t>
+              <w:t>|</w:t>
+            </w:r>
+            <w:proofErr w:type="gramEnd"/>
+            <w:r>
+              <w:rPr>
+                <w:color w:val="C8DCF0"/>
+                <w:sz w:val="19"/>
+                <w:szCs w:val="19"/>
+              </w:rPr>
+              <w:t xml:space="preserve"> </w:t>
             </w:r>
             <w:r>
               <w:rPr>
@@ -237,11 +290,11 @@
                   <wp:effectExtent l="0" t="0" r="0" b="9525"/>
                   <wp:docPr id="1" name="Photo"/>
                   <wp:cNvGraphicFramePr>
-                    <a:graphicFrameLocks noChangeAspect="1"/>
+                    <a:graphicFrameLocks xmlns:a="http://schemas.openxmlformats.org/drawingml/2006/main" noChangeAspect="1"/>
                   </wp:cNvGraphicFramePr>
-                  <a:graphic>
+                  <a:graphic xmlns:a="http://schemas.openxmlformats.org/drawingml/2006/main">
                     <a:graphicData uri="http://schemas.openxmlformats.org/drawingml/2006/picture">
-                      <pic:pic>
+                      <pic:pic xmlns:pic="http://schemas.openxmlformats.org/drawingml/2006/picture">
                         <pic:nvPicPr>
                           <pic:cNvPr id="1" name="Photo"/>
                           <pic:cNvPicPr/>
@@ -250,7 +303,7 @@
                           <a:blip r:embed="rId5" cstate="print">
                             <a:extLst>
                               <a:ext uri="{28A0092B-C50C-407E-A947-70E740481C1C}">
-                                <a14:useLocalDpi val="0"/>
+                                <a14:useLocalDpi xmlns:a14="http://schemas.microsoft.com/office/drawing/2010/main" val="0"/>
                               </a:ext>
                             </a:extLst>
                           </a:blip>
@@ -559,7 +612,23 @@
                 <w:sz w:val="18"/>
                 <w:szCs w:val="18"/>
               </w:rPr>
-              <w:t xml:space="preserve">Python, XML, QWeb, </w:t>
+              <w:t xml:space="preserve">Python, XML, </w:t>
+            </w:r>
+            <w:proofErr w:type="spellStart"/>
+            <w:r>
+              <w:rPr>
+                <w:sz w:val="18"/>
+                <w:szCs w:val="18"/>
+              </w:rPr>
+              <w:t>QWeb</w:t>
+            </w:r>
+            <w:proofErr w:type="spellEnd"/>
+            <w:r>
+              <w:rPr>
+                <w:sz w:val="18"/>
+                <w:szCs w:val="18"/>
+              </w:rPr>
+              <w:t xml:space="preserve">, </w:t>
             </w:r>
             <w:r>
               <w:rPr>
@@ -752,6 +821,7 @@
               </w:rPr>
               <w:t xml:space="preserve"> </w:t>
             </w:r>
+            <w:proofErr w:type="spellStart"/>
             <w:r>
               <w:rPr>
                 <w:sz w:val="18"/>
@@ -759,6 +829,7 @@
               </w:rPr>
               <w:t>flask</w:t>
             </w:r>
+            <w:proofErr w:type="spellEnd"/>
             <w:r>
               <w:rPr>
                 <w:sz w:val="18"/>
@@ -769,6 +840,7 @@
             <w:r>
               <w:t xml:space="preserve"> </w:t>
             </w:r>
+            <w:proofErr w:type="spellStart"/>
             <w:r>
               <w:rPr>
                 <w:sz w:val="18"/>
@@ -776,6 +848,7 @@
               </w:rPr>
               <w:t>FastAPI</w:t>
             </w:r>
+            <w:proofErr w:type="spellEnd"/>
           </w:p>
         </w:tc>
         <w:tc>
@@ -1139,7 +1212,29 @@
           <w:sz w:val="18"/>
           <w:szCs w:val="18"/>
         </w:rPr>
-        <w:t>SNTF (Sté Nationale des Transports Ferroviaires)  •  Alger, Algérie</w:t>
+        <w:t xml:space="preserve">SNTF (Sté Nationale des Transports </w:t>
+      </w:r>
+      <w:proofErr w:type="gramStart"/>
+      <w:r>
+        <w:rPr>
+          <w:i/>
+          <w:iCs/>
+          <w:color w:val="555555"/>
+          <w:sz w:val="18"/>
+          <w:szCs w:val="18"/>
+        </w:rPr>
+        <w:t>Ferroviaires)  •</w:t>
+      </w:r>
+      <w:proofErr w:type="gramEnd"/>
+      <w:r>
+        <w:rPr>
+          <w:i/>
+          <w:iCs/>
+          <w:color w:val="555555"/>
+          <w:sz w:val="18"/>
+          <w:szCs w:val="18"/>
+        </w:rPr>
+        <w:t xml:space="preserve">  Alger, Algérie</w:t>
       </w:r>
       <w:r>
         <w:rPr>
@@ -1157,6 +1252,7 @@
         <w:spacing w:before="40" w:after="40"/>
         <w:ind w:left="360" w:hanging="240"/>
       </w:pPr>
+      <w:proofErr w:type="gramStart"/>
       <w:r>
         <w:rPr>
           <w:b/>
@@ -1172,7 +1268,15 @@
           <w:sz w:val="19"/>
           <w:szCs w:val="19"/>
         </w:rPr>
-        <w:t>Piloter la digitalisation de l'entreprise, notamment la mise en œuvre et l'optimisation de l'ERP Odoo</w:t>
+        <w:t>Piloter</w:t>
+      </w:r>
+      <w:proofErr w:type="gramEnd"/>
+      <w:r>
+        <w:rPr>
+          <w:sz w:val="19"/>
+          <w:szCs w:val="19"/>
+        </w:rPr>
+        <w:t xml:space="preserve"> la digitalisation de l'entreprise, notamment la mise en œuvre et l'optimisation de l'ERP Odoo</w:t>
       </w:r>
     </w:p>
     <w:p>
@@ -1180,6 +1284,7 @@
         <w:spacing w:before="40" w:after="40"/>
         <w:ind w:left="360" w:hanging="240"/>
       </w:pPr>
+      <w:proofErr w:type="gramStart"/>
       <w:r>
         <w:rPr>
           <w:b/>
@@ -1195,7 +1300,15 @@
           <w:sz w:val="19"/>
           <w:szCs w:val="19"/>
         </w:rPr>
-        <w:t>Superviser une équipe de 20 personnes réparties sur le siège de la direction générale (5-6 développeurs) et dans les 4 directions régionales SNTF (2-3 techniciens par région)</w:t>
+        <w:t>Superviser</w:t>
+      </w:r>
+      <w:proofErr w:type="gramEnd"/>
+      <w:r>
+        <w:rPr>
+          <w:sz w:val="19"/>
+          <w:szCs w:val="19"/>
+        </w:rPr>
+        <w:t xml:space="preserve"> une équipe de 20 personnes réparties sur le siège de la direction générale (5-6 développeurs) et dans les 4 directions régionales SNTF (2-3 techniciens par région)</w:t>
       </w:r>
     </w:p>
     <w:p>
@@ -1203,6 +1316,7 @@
         <w:spacing w:before="40" w:after="40"/>
         <w:ind w:left="360" w:hanging="240"/>
       </w:pPr>
+      <w:proofErr w:type="gramStart"/>
       <w:r>
         <w:rPr>
           <w:b/>
@@ -1218,7 +1332,15 @@
           <w:sz w:val="19"/>
           <w:szCs w:val="19"/>
         </w:rPr>
-        <w:t>Assurer la gestion complète du cycle de vie des projets (planification → déploiement → amélioration)</w:t>
+        <w:t>Assurer</w:t>
+      </w:r>
+      <w:proofErr w:type="gramEnd"/>
+      <w:r>
+        <w:rPr>
+          <w:sz w:val="19"/>
+          <w:szCs w:val="19"/>
+        </w:rPr>
+        <w:t xml:space="preserve"> la gestion complète du cycle de vie des projets (planification → déploiement → amélioration)</w:t>
       </w:r>
     </w:p>
     <w:p>
@@ -1226,6 +1348,7 @@
         <w:spacing w:before="40" w:after="40"/>
         <w:ind w:left="360" w:hanging="240"/>
       </w:pPr>
+      <w:proofErr w:type="gramStart"/>
       <w:r>
         <w:rPr>
           <w:b/>
@@ -1241,7 +1364,15 @@
           <w:sz w:val="19"/>
           <w:szCs w:val="19"/>
         </w:rPr>
-        <w:t>Collaborer avec les parties prenantes pour identifier les besoins métier et proposer des solutions innovantes</w:t>
+        <w:t>Collaborer</w:t>
+      </w:r>
+      <w:proofErr w:type="gramEnd"/>
+      <w:r>
+        <w:rPr>
+          <w:sz w:val="19"/>
+          <w:szCs w:val="19"/>
+        </w:rPr>
+        <w:t xml:space="preserve"> avec les parties prenantes pour identifier les besoins métier et proposer des solutions innovantes</w:t>
       </w:r>
     </w:p>
     <w:p>
@@ -1249,6 +1380,7 @@
         <w:spacing w:before="40" w:after="40"/>
         <w:ind w:left="360" w:hanging="240"/>
       </w:pPr>
+      <w:proofErr w:type="gramStart"/>
       <w:r>
         <w:rPr>
           <w:b/>
@@ -1264,7 +1396,15 @@
           <w:sz w:val="19"/>
           <w:szCs w:val="19"/>
         </w:rPr>
-        <w:t>Mesurer les résultats via des KPIs et proposer des axes d'amélioration continue</w:t>
+        <w:t>Mesurer</w:t>
+      </w:r>
+      <w:proofErr w:type="gramEnd"/>
+      <w:r>
+        <w:rPr>
+          <w:sz w:val="19"/>
+          <w:szCs w:val="19"/>
+        </w:rPr>
+        <w:t xml:space="preserve"> les résultats via des KPIs et proposer des axes d'amélioration continue</w:t>
       </w:r>
     </w:p>
     <w:p>
@@ -1301,7 +1441,7 @@
           <w:sz w:val="19"/>
           <w:szCs w:val="19"/>
         </w:rPr>
-        <w:t xml:space="preserve">Valeurs ajoutées à la SNTF :</w:t>
+        <w:t>Valeurs ajoutées à la SNTF :</w:t>
       </w:r>
     </w:p>
     <w:p>
@@ -1315,7 +1455,7 @@
           <w:sz w:val="18"/>
           <w:szCs w:val="18"/>
         </w:rPr>
-        <w:t xml:space="preserve">–  Réduction des dépenses : développement des solutions en interne plutôt que recours à des fournisseurs externes.</w:t>
+        <w:t>–  Réduction des dépenses : développement des solutions en interne plutôt que recours à des fournisseurs externes.</w:t>
       </w:r>
     </w:p>
     <w:p>
@@ -1329,19 +1469,12 @@
           <w:sz w:val="18"/>
           <w:szCs w:val="18"/>
         </w:rPr>
-        <w:t xml:space="preserve">–  Initiation d'une équipe d'ingénieurs au développement Odoo et aux bonnes pratiques (code clair et commenté, Git).</w:t>
-      </w:r>
-    </w:p>
-    <w:p>
-      <w:pPr>
-        <w:spacing w:before="60"/>
-      </w:pPr>
+        <w:t>–  Initiation d'une équipe d'ingénieurs au développement Odoo et aux bonnes pratiques (code clair et commenté, Git).</w:t>
+      </w:r>
     </w:p>
     <w:p>
       <w:pPr>
         <w:spacing w:before="200" w:after="30"/>
-      </w:pPr>
-      <w:r>
         <w:rPr>
           <w:b/>
           <w:bCs/>
@@ -1349,398 +1482,11 @@
           <w:sz w:val="21"/>
           <w:szCs w:val="21"/>
         </w:rPr>
-        <w:t>Chef de Division Web &amp; ERP</w:t>
-      </w:r>
-    </w:p>
-    <w:p>
-      <w:pPr>
-        <w:spacing w:after="60"/>
-      </w:pPr>
-      <w:r>
-        <w:rPr>
-          <w:i/>
-          <w:iCs/>
-          <w:color w:val="555555"/>
-          <w:sz w:val="18"/>
-          <w:szCs w:val="18"/>
-        </w:rPr>
-        <w:t>SNTF (Sté Nationale des Transports Ferroviaires)  •  Alger, Algérie</w:t>
-      </w:r>
-      <w:r>
-        <w:rPr>
-          <w:b/>
-          <w:bCs/>
-          <w:color w:val="E8840A"/>
-          <w:sz w:val="18"/>
-          <w:szCs w:val="18"/>
-        </w:rPr>
-        <w:t xml:space="preserve">     déc. 2019 — fév. 2023</w:t>
-      </w:r>
-    </w:p>
-    <w:p>
-      <w:pPr>
-        <w:spacing w:before="40" w:after="40"/>
-        <w:ind w:left="360" w:hanging="240"/>
-      </w:pPr>
-      <w:r>
-        <w:rPr>
-          <w:b/>
-          <w:bCs/>
-          <w:color w:val="2E6EA6"/>
-          <w:sz w:val="19"/>
-          <w:szCs w:val="19"/>
-        </w:rPr>
-        <w:t xml:space="preserve">▸  </w:t>
-      </w:r>
-      <w:r>
-        <w:rPr>
-          <w:sz w:val="19"/>
-          <w:szCs w:val="19"/>
-        </w:rPr>
-        <w:t>Diriger une équipe de 5 à 6 développeurs spécialisés Odoo et superviser les projets web</w:t>
-      </w:r>
-    </w:p>
-    <w:p>
-      <w:pPr>
-        <w:spacing w:before="40" w:after="40"/>
-        <w:ind w:left="360" w:hanging="240"/>
-      </w:pPr>
-      <w:r>
-        <w:rPr>
-          <w:b/>
-          <w:bCs/>
-          <w:color w:val="2E6EA6"/>
-          <w:sz w:val="19"/>
-          <w:szCs w:val="19"/>
-        </w:rPr>
-        <w:t xml:space="preserve">▸  </w:t>
-      </w:r>
-      <w:r>
-        <w:rPr>
-          <w:sz w:val="19"/>
-          <w:szCs w:val="19"/>
-        </w:rPr>
-        <w:t>Développer et intégrer des solutions personnalisées aux besoins de l'entreprise</w:t>
-      </w:r>
-    </w:p>
-    <w:p>
-      <w:pPr>
-        <w:spacing w:before="40"/>
-      </w:pPr>
-    </w:p>
-    <w:p>
-      <w:pPr>
-        <w:spacing w:before="60" w:after="20"/>
-        <w:ind w:left="360"/>
-      </w:pPr>
-      <w:r>
-        <w:rPr>
-          <w:b/>
-          <w:bCs/>
-          <w:color w:val="1A3C5E"/>
-          <w:sz w:val="19"/>
-          <w:szCs w:val="19"/>
-        </w:rPr>
-        <w:t>Projets clés livrés :</w:t>
-      </w:r>
-    </w:p>
-    <w:p>
-      <w:pPr>
-        <w:spacing w:before="80" w:after="20"/>
-        <w:ind w:left="360"/>
-      </w:pPr>
-      <w:r>
-        <w:rPr>
-          <w:b/>
-          <w:bCs/>
-          <w:color w:val="E8840A"/>
-          <w:sz w:val="19"/>
-          <w:szCs w:val="19"/>
-        </w:rPr>
-        <w:lastRenderedPageBreak/>
-        <w:t xml:space="preserve">◆ </w:t>
-      </w:r>
-      <w:r>
-        <w:rPr>
-          <w:b/>
-          <w:bCs/>
-          <w:color w:val="1A3C5E"/>
-          <w:sz w:val="19"/>
-          <w:szCs w:val="19"/>
-        </w:rPr>
-        <w:t>Solution de Gestion du Transport de Marchandises</w:t>
-      </w:r>
-    </w:p>
-    <w:p>
-      <w:pPr>
-        <w:spacing w:before="20" w:after="20"/>
-        <w:ind w:left="720" w:hanging="240"/>
-      </w:pPr>
-      <w:r>
-        <w:rPr>
-          <w:color w:val="555555"/>
-          <w:sz w:val="18"/>
-          <w:szCs w:val="18"/>
-        </w:rPr>
-        <w:t>–  Solution ERP complète couvrant l'ensemble du cycle fret ferroviaire :</w:t>
-      </w:r>
-    </w:p>
-    <w:p>
-      <w:pPr>
-        <w:spacing w:before="20" w:after="20"/>
-        <w:ind w:left="960" w:hanging="240"/>
-      </w:pPr>
-      <w:r>
-        <w:rPr>
-          <w:color w:val="555555"/>
-          <w:sz w:val="18"/>
-          <w:szCs w:val="18"/>
-        </w:rPr>
-        <w:t>·  Référentiel produits : catalogue des marchandises (nature, prix, contraintes) pour sélectionner le type de wagon adapté</w:t>
-      </w:r>
-    </w:p>
-    <w:p>
-      <w:pPr>
-        <w:spacing w:before="20" w:after="20"/>
-        <w:ind w:left="960" w:hanging="240"/>
-      </w:pPr>
-      <w:r>
-        <w:rPr>
-          <w:color w:val="555555"/>
-          <w:sz w:val="18"/>
-          <w:szCs w:val="18"/>
-        </w:rPr>
-        <w:t>·  Gestion des déclarations d'expédition (équivalent bon de commande fret)</w:t>
-      </w:r>
-    </w:p>
-    <w:p>
-      <w:pPr>
-        <w:spacing w:before="20" w:after="20"/>
-        <w:ind w:left="960" w:hanging="240"/>
-      </w:pPr>
-      <w:r>
-        <w:rPr>
-          <w:color w:val="555555"/>
-          <w:sz w:val="18"/>
-          <w:szCs w:val="18"/>
-        </w:rPr>
-        <w:t>·  Gestion des conventions tarifaires clients et remises commerciales</w:t>
-      </w:r>
-    </w:p>
-    <w:p>
-      <w:pPr>
-        <w:spacing w:before="20" w:after="20"/>
-        <w:ind w:left="960" w:hanging="240"/>
-      </w:pPr>
-      <w:r>
-        <w:rPr>
-          <w:color w:val="555555"/>
-          <w:sz w:val="18"/>
-          <w:szCs w:val="18"/>
-        </w:rPr>
-        <w:t>·  Facturation client automatisée en fin de cycle</w:t>
-      </w:r>
-    </w:p>
-    <w:p>
-      <w:pPr>
-        <w:spacing w:before="20" w:after="20"/>
-        <w:ind w:left="960" w:hanging="240"/>
-      </w:pPr>
-      <w:r>
-        <w:rPr>
-          <w:color w:val="555555"/>
-          <w:sz w:val="18"/>
-          <w:szCs w:val="18"/>
-        </w:rPr>
-        <w:t>·  Transfert instantané des documents entre gares (expéditeur → destinataire) via Odoo web, remplaçant l'échange physique de documents</w:t>
-      </w:r>
-    </w:p>
-    <w:p>
-      <w:pPr>
-        <w:spacing w:before="80" w:after="20"/>
-        <w:ind w:left="360"/>
-      </w:pPr>
-      <w:r>
-        <w:rPr>
-          <w:b/>
-          <w:bCs/>
-          <w:color w:val="E8840A"/>
-          <w:sz w:val="19"/>
-          <w:szCs w:val="19"/>
-        </w:rPr>
-        <w:t xml:space="preserve">◆ </w:t>
-      </w:r>
-      <w:r>
-        <w:rPr>
-          <w:b/>
-          <w:bCs/>
-          <w:color w:val="1A3C5E"/>
-          <w:sz w:val="19"/>
-          <w:szCs w:val="19"/>
-        </w:rPr>
-        <w:t>Solution de Gestion des Billets Voyageurs</w:t>
-      </w:r>
-    </w:p>
-    <w:p>
-      <w:pPr>
-        <w:spacing w:before="20" w:after="20"/>
-        <w:ind w:left="720" w:hanging="240"/>
-      </w:pPr>
-      <w:r>
-        <w:rPr>
-          <w:color w:val="555555"/>
-          <w:sz w:val="18"/>
-          <w:szCs w:val="18"/>
-        </w:rPr>
-        <w:t>–  Solution billettique complète couvrant l'ensemble du cycle voyageur :</w:t>
-      </w:r>
-    </w:p>
-    <w:p>
-      <w:pPr>
-        <w:spacing w:before="20" w:after="20"/>
-        <w:ind w:left="960" w:hanging="240"/>
-      </w:pPr>
-      <w:r>
-        <w:rPr>
-          <w:color w:val="555555"/>
-          <w:sz w:val="18"/>
-          <w:szCs w:val="18"/>
-        </w:rPr>
-        <w:t>·  Référentiel ferroviaire : gestion des trains, types de trains, gares de passage, relations (origines/destinations) et calendriers de circulation</w:t>
-      </w:r>
-    </w:p>
-    <w:p>
-      <w:pPr>
-        <w:spacing w:before="20" w:after="20"/>
-        <w:ind w:left="960" w:hanging="240"/>
-      </w:pPr>
-      <w:r>
-        <w:rPr>
-          <w:color w:val="555555"/>
-          <w:sz w:val="18"/>
-          <w:szCs w:val="18"/>
-        </w:rPr>
-        <w:t>·  Gestion des profils voyageurs et tarification différenciée (remises par catégorie : étudiant, retraité, abonné…)</w:t>
-      </w:r>
-    </w:p>
-    <w:p>
-      <w:pPr>
-        <w:spacing w:before="20" w:after="20"/>
-        <w:ind w:left="960" w:hanging="240"/>
-      </w:pPr>
-      <w:r>
-        <w:rPr>
-          <w:color w:val="555555"/>
-          <w:sz w:val="18"/>
-          <w:szCs w:val="18"/>
-        </w:rPr>
-        <w:t>·  Vente et émission de billets en gare avec synchronisation bidirectionnelle : remontée des données de ventes vers le national, déploiement des configurations (tarifs, trains, calendriers) du national vers les gares</w:t>
-      </w:r>
-    </w:p>
-    <w:p>
-      <w:pPr>
-        <w:spacing w:before="20" w:after="20"/>
-        <w:ind w:left="960" w:hanging="240"/>
-      </w:pPr>
-      <w:r>
-        <w:rPr>
-          <w:color w:val="555555"/>
-          <w:sz w:val="18"/>
-          <w:szCs w:val="18"/>
-        </w:rPr>
-        <w:t>·  Tableaux de bord analytiques multi-niveaux : ventes par gare, par région et par relation (origine/destination)</w:t>
-      </w:r>
-    </w:p>
-    <w:p>
-      <w:pPr>
-        <w:spacing w:before="80" w:after="20"/>
-        <w:ind w:left="360"/>
-      </w:pPr>
-      <w:r>
-        <w:rPr>
-          <w:b/>
-          <w:bCs/>
-          <w:color w:val="E8840A"/>
-          <w:sz w:val="19"/>
-          <w:szCs w:val="19"/>
-        </w:rPr>
-        <w:t xml:space="preserve">◆ </w:t>
-      </w:r>
-      <w:r>
-        <w:rPr>
-          <w:b/>
-          <w:bCs/>
-          <w:color w:val="1A3C5E"/>
-          <w:sz w:val="19"/>
-          <w:szCs w:val="19"/>
-        </w:rPr>
-        <w:t>Solution d'Archivage des Documents</w:t>
-      </w:r>
-    </w:p>
-    <w:p>
-      <w:pPr>
-        <w:spacing w:before="20" w:after="20"/>
-        <w:ind w:left="720" w:hanging="240"/>
-      </w:pPr>
-      <w:r>
-        <w:rPr>
-          <w:color w:val="555555"/>
-          <w:sz w:val="18"/>
-          <w:szCs w:val="18"/>
-        </w:rPr>
-        <w:t>–  Système d'archivage et gestion des documents internes</w:t>
-      </w:r>
-    </w:p>
-    <w:p>
-      <w:pPr>
-        <w:spacing w:before="80" w:after="20"/>
-        <w:ind w:left="360"/>
-      </w:pPr>
-      <w:r>
-        <w:rPr>
-          <w:b/>
-          <w:bCs/>
-          <w:color w:val="E8840A"/>
-          <w:sz w:val="19"/>
-          <w:szCs w:val="19"/>
-        </w:rPr>
-        <w:t xml:space="preserve">◆ </w:t>
-      </w:r>
-      <w:r>
-        <w:rPr>
-          <w:b/>
-          <w:bCs/>
-          <w:color w:val="1A3C5E"/>
-          <w:sz w:val="19"/>
-          <w:szCs w:val="19"/>
-        </w:rPr>
-        <w:t>Outil de Synthèse des Incidents Ferroviaires</w:t>
-      </w:r>
-    </w:p>
-    <w:p>
-      <w:pPr>
-        <w:spacing w:before="20" w:after="20"/>
-        <w:ind w:left="720" w:hanging="240"/>
-      </w:pPr>
-      <w:r>
-        <w:rPr>
-          <w:color w:val="555555"/>
-          <w:sz w:val="18"/>
-          <w:szCs w:val="18"/>
-        </w:rPr>
-        <w:t>–  Remplacement du suivi par fichiers Excel par des tableaux de bord Odoo interactifs : meilleure visibilité, priorisation des incidents et aide à la décision en temps réel</w:t>
-      </w:r>
-    </w:p>
-    <w:p>
-      <w:pPr>
-        <w:spacing w:before="60"/>
       </w:pPr>
     </w:p>
     <w:p>
       <w:pPr>
         <w:spacing w:before="200" w:after="30"/>
-      </w:pPr>
-      <w:r>
         <w:rPr>
           <w:b/>
           <w:bCs/>
@@ -1748,375 +1494,6 @@
           <w:sz w:val="21"/>
           <w:szCs w:val="21"/>
         </w:rPr>
-        <w:t>Ingénieur Informatique — Consultant ERP &amp; SI</w:t>
-      </w:r>
-    </w:p>
-    <w:p>
-      <w:pPr>
-        <w:spacing w:after="60"/>
-      </w:pPr>
-      <w:r>
-        <w:rPr>
-          <w:i/>
-          <w:iCs/>
-          <w:color w:val="555555"/>
-          <w:sz w:val="18"/>
-          <w:szCs w:val="18"/>
-        </w:rPr>
-        <w:t>AASYS  •  Alger, Algérie</w:t>
-      </w:r>
-      <w:r>
-        <w:rPr>
-          <w:b/>
-          <w:bCs/>
-          <w:color w:val="E8840A"/>
-          <w:sz w:val="18"/>
-          <w:szCs w:val="18"/>
-        </w:rPr>
-        <w:t xml:space="preserve">     mars 2019 — déc. 2019</w:t>
-      </w:r>
-    </w:p>
-    <w:p>
-      <w:pPr>
-        <w:spacing w:before="80" w:after="20"/>
-        <w:ind w:left="360"/>
-      </w:pPr>
-      <w:r>
-        <w:rPr>
-          <w:b/>
-          <w:bCs/>
-          <w:color w:val="E8840A"/>
-          <w:sz w:val="19"/>
-          <w:szCs w:val="19"/>
-        </w:rPr>
-        <w:t xml:space="preserve">◆ </w:t>
-      </w:r>
-      <w:r>
-        <w:rPr>
-          <w:b/>
-          <w:bCs/>
-          <w:color w:val="1A3C5E"/>
-          <w:sz w:val="19"/>
-          <w:szCs w:val="19"/>
-        </w:rPr>
-        <w:t>Portage de modules Odoo vers l'ERP Open-Prod :</w:t>
-      </w:r>
-    </w:p>
-    <w:p>
-      <w:pPr>
-        <w:spacing w:before="20" w:after="20"/>
-        <w:ind w:left="960" w:hanging="240"/>
-      </w:pPr>
-      <w:r>
-        <w:rPr>
-          <w:color w:val="555555"/>
-          <w:sz w:val="18"/>
-          <w:szCs w:val="18"/>
-        </w:rPr>
-        <w:t>·  Analyse et adaptation du code source des modules Odoo (RH, Paie) pour les rendre compatibles et fonctionnels sur Open-Prod</w:t>
-      </w:r>
-    </w:p>
-    <w:p>
-      <w:pPr>
-        <w:spacing w:before="20" w:after="20"/>
-        <w:ind w:left="960" w:hanging="240"/>
-      </w:pPr>
-      <w:r>
-        <w:rPr>
-          <w:color w:val="555555"/>
-          <w:sz w:val="18"/>
-          <w:szCs w:val="18"/>
-        </w:rPr>
-        <w:t>·  Mapping des modèles de données, ajustement des vues et des workflows métier entre les deux plateformes</w:t>
-      </w:r>
-    </w:p>
-    <w:p>
-      <w:pPr>
-        <w:spacing w:before="20" w:after="20"/>
-        <w:ind w:left="960" w:hanging="240"/>
-      </w:pPr>
-      <w:r>
-        <w:rPr>
-          <w:color w:val="555555"/>
-          <w:sz w:val="18"/>
-          <w:szCs w:val="18"/>
-        </w:rPr>
-        <w:t>·  Tests de non-régression et validation fonctionnelle avec les équipes métier</w:t>
-      </w:r>
-    </w:p>
-    <w:p>
-      <w:pPr>
-        <w:spacing w:before="80" w:after="20"/>
-        <w:ind w:left="360"/>
-      </w:pPr>
-      <w:r>
-        <w:rPr>
-          <w:b/>
-          <w:bCs/>
-          <w:color w:val="E8840A"/>
-          <w:sz w:val="19"/>
-          <w:szCs w:val="19"/>
-        </w:rPr>
-        <w:t xml:space="preserve">◆ </w:t>
-      </w:r>
-      <w:r>
-        <w:rPr>
-          <w:b/>
-          <w:bCs/>
-          <w:color w:val="1A3C5E"/>
-          <w:sz w:val="19"/>
-          <w:szCs w:val="19"/>
-        </w:rPr>
-        <w:t>Parser des factures PDF fournisseurs :</w:t>
-      </w:r>
-    </w:p>
-    <w:p>
-      <w:pPr>
-        <w:spacing w:before="20" w:after="20"/>
-        <w:ind w:left="960" w:hanging="240"/>
-      </w:pPr>
-      <w:r>
-        <w:rPr>
-          <w:color w:val="555555"/>
-          <w:sz w:val="18"/>
-          <w:szCs w:val="18"/>
-        </w:rPr>
-        <w:t>·  Développement d'un moteur d'analyse de fichiers PDF pour extraire automatiquement les données de facturation (références, montants, fournisseurs, TVA…)</w:t>
-      </w:r>
-    </w:p>
-    <w:p>
-      <w:pPr>
-        <w:spacing w:before="20" w:after="20"/>
-        <w:ind w:left="960" w:hanging="240"/>
-      </w:pPr>
-      <w:r>
-        <w:rPr>
-          <w:color w:val="555555"/>
-          <w:sz w:val="18"/>
-          <w:szCs w:val="18"/>
-        </w:rPr>
-        <w:t>·  Création automatique des factures correspondantes dans Odoo, éliminant la ressaisie manuelle</w:t>
-      </w:r>
-    </w:p>
-    <w:p>
-      <w:pPr>
-        <w:spacing w:before="20" w:after="20"/>
-        <w:ind w:left="960" w:hanging="240"/>
-      </w:pPr>
-      <w:r>
-        <w:rPr>
-          <w:color w:val="555555"/>
-          <w:sz w:val="18"/>
-          <w:szCs w:val="18"/>
-        </w:rPr>
-        <w:t>·  Taux de fiabilité d'extraction supérieur à 99% atteint en production</w:t>
-      </w:r>
-    </w:p>
-    <w:p>
-      <w:pPr>
-        <w:spacing w:before="80" w:after="20"/>
-        <w:ind w:left="360"/>
-        <w:rPr>
-          <w:b/>
-          <w:bCs/>
-          <w:color w:val="1A3C5E"/>
-          <w:sz w:val="19"/>
-          <w:szCs w:val="19"/>
-        </w:rPr>
-      </w:pPr>
-      <w:r>
-        <w:rPr>
-          <w:b/>
-          <w:bCs/>
-          <w:color w:val="E8840A"/>
-          <w:sz w:val="19"/>
-          <w:szCs w:val="19"/>
-        </w:rPr>
-        <w:t xml:space="preserve">◆ </w:t>
-      </w:r>
-      <w:r>
-        <w:rPr>
-          <w:b/>
-          <w:bCs/>
-          <w:color w:val="1A3C5E"/>
-          <w:sz w:val="19"/>
-          <w:szCs w:val="19"/>
-        </w:rPr>
-        <w:t xml:space="preserve">Solution ERP </w:t>
-      </w:r>
-      <w:r>
-        <w:rPr>
-          <w:b/>
-          <w:bCs/>
-          <w:color w:val="1A3C5E"/>
-          <w:sz w:val="19"/>
-          <w:szCs w:val="19"/>
-        </w:rPr>
-        <w:t xml:space="preserve">(domaine </w:t>
-      </w:r>
-      <w:r>
-        <w:rPr>
-          <w:b/>
-          <w:bCs/>
-          <w:color w:val="1A3C5E"/>
-          <w:sz w:val="19"/>
-          <w:szCs w:val="19"/>
-        </w:rPr>
-        <w:t>Médicale</w:t>
-      </w:r>
-      <w:r>
-        <w:rPr>
-          <w:b/>
-          <w:bCs/>
-          <w:color w:val="1A3C5E"/>
-          <w:sz w:val="19"/>
-          <w:szCs w:val="19"/>
-        </w:rPr>
-        <w:t>)</w:t>
-      </w:r>
-      <w:r>
-        <w:rPr>
-          <w:b/>
-          <w:bCs/>
-          <w:color w:val="1A3C5E"/>
-          <w:sz w:val="19"/>
-          <w:szCs w:val="19"/>
-        </w:rPr>
-        <w:t xml:space="preserve"> </w:t>
-      </w:r>
-    </w:p>
-    <w:p>
-      <w:pPr>
-        <w:spacing w:before="80" w:after="20"/>
-        <w:ind w:left="360" w:firstLine="348"/>
-      </w:pPr>
-      <w:r>
-        <w:t xml:space="preserve">. </w:t>
-      </w:r>
-      <w:r>
-        <w:t>Gestion des ressources humaines et de la paie (employés, contrats, congés, bulletins de salaire)</w:t>
-      </w:r>
-    </w:p>
-    <w:p>
-      <w:pPr>
-        <w:spacing w:before="60"/>
-        <w:ind w:firstLine="708"/>
-      </w:pPr>
-      <w:r>
-        <w:t>.</w:t>
-      </w:r>
-      <w:r>
-        <w:t xml:space="preserve"> </w:t>
-      </w:r>
-      <w:r>
-        <w:t>Gestion du parc automobile (véhicules, affectations, maintenance)</w:t>
-      </w:r>
-    </w:p>
-    <w:p>
-      <w:pPr>
-        <w:spacing w:before="60"/>
-        <w:ind w:firstLine="708"/>
-      </w:pPr>
-      <w:r>
-        <w:t xml:space="preserve">. </w:t>
-      </w:r>
-      <w:r>
-        <w:t>Vente et location d'équipements médicaux d'analyse : gestion des contrats de location, suivi de la maintenance et renouvellements</w:t>
-      </w:r>
-    </w:p>
-    <w:p>
-      <w:pPr>
-        <w:spacing w:before="60"/>
-        <w:ind w:firstLine="708"/>
-      </w:pPr>
-      <w:r>
-        <w:t xml:space="preserve">. </w:t>
-      </w:r>
-      <w:r>
-        <w:t>Gestion des stocks de médicaments importés avec traçabilité (lots, dates de péremption)</w:t>
-      </w:r>
-    </w:p>
-    <w:p>
-      <w:pPr>
-        <w:spacing w:before="60"/>
-        <w:ind w:firstLine="708"/>
-      </w:pPr>
-      <w:r>
-        <w:t xml:space="preserve">. </w:t>
-      </w:r>
-      <w:r>
-        <w:t>Vente aux clients (hôpitaux, cliniques, laboratoires), facturation et suivi des encaissements</w:t>
-      </w:r>
-    </w:p>
-    <w:p>
-      <w:pPr>
-        <w:spacing w:before="80" w:after="20"/>
-        <w:ind w:left="360"/>
-      </w:pPr>
-      <w:r>
-        <w:rPr>
-          <w:rFonts w:ascii="Cambria Math" w:hAnsi="Cambria Math" w:cs="Cambria Math"/>
-          <w:b/>
-          <w:bCs/>
-          <w:color w:val="E8840A"/>
-          <w:sz w:val="19"/>
-          <w:szCs w:val="19"/>
-        </w:rPr>
-        <w:t>◆</w:t>
-      </w:r>
-      <w:r>
-        <w:rPr>
-          <w:b/>
-          <w:bCs/>
-          <w:color w:val="E8840A"/>
-          <w:sz w:val="19"/>
-          <w:szCs w:val="19"/>
-        </w:rPr>
-        <w:t xml:space="preserve"> </w:t>
-      </w:r>
-      <w:r>
-        <w:rPr>
-          <w:b/>
-          <w:bCs/>
-          <w:color w:val="1A3C5E"/>
-          <w:sz w:val="19"/>
-          <w:szCs w:val="19"/>
-        </w:rPr>
-        <w:t xml:space="preserve">Valeurs ajoutées à AASYS :</w:t>
-      </w:r>
-    </w:p>
-    <w:p>
-      <w:pPr>
-        <w:spacing w:before="20" w:after="20"/>
-        <w:ind w:left="720" w:hanging="240"/>
-      </w:pPr>
-      <w:r>
-        <w:rPr>
-          <w:color w:val="555555"/>
-          <w:sz w:val="18"/>
-          <w:szCs w:val="18"/>
-        </w:rPr>
-        <w:t xml:space="preserve">–  Tableaux de bord de suivi des projets.</w:t>
-      </w:r>
-    </w:p>
-    <w:p>
-      <w:pPr>
-        <w:spacing w:before="20" w:after="20"/>
-        <w:ind w:left="720" w:hanging="240"/>
-      </w:pPr>
-      <w:r>
-        <w:rPr>
-          <w:color w:val="555555"/>
-          <w:sz w:val="18"/>
-          <w:szCs w:val="18"/>
-        </w:rPr>
-        <w:t xml:space="preserve">–  Réduction des délais de réalisation : suivi quotidien de l'avancement des tâches et déblocage des points bloquants.</w:t>
-      </w:r>
-    </w:p>
-    <w:p>
-      <w:pPr>
-        <w:spacing w:before="60"/>
-        <w:ind w:firstLine="708"/>
       </w:pPr>
     </w:p>
     <w:p>
@@ -2131,7 +1508,8 @@
           <w:sz w:val="21"/>
           <w:szCs w:val="21"/>
         </w:rPr>
-        <w:t>Développeur Odoo</w:t>
+        <w:lastRenderedPageBreak/>
+        <w:t>Chef de Division Web &amp; ERP</w:t>
       </w:r>
     </w:p>
     <w:p>
@@ -2146,7 +1524,29 @@
           <w:sz w:val="18"/>
           <w:szCs w:val="18"/>
         </w:rPr>
-        <w:t>MLMConseil  •  Bouira, Algérie</w:t>
+        <w:t xml:space="preserve">SNTF (Sté Nationale des Transports </w:t>
+      </w:r>
+      <w:proofErr w:type="gramStart"/>
+      <w:r>
+        <w:rPr>
+          <w:i/>
+          <w:iCs/>
+          <w:color w:val="555555"/>
+          <w:sz w:val="18"/>
+          <w:szCs w:val="18"/>
+        </w:rPr>
+        <w:t>Ferroviaires)  •</w:t>
+      </w:r>
+      <w:proofErr w:type="gramEnd"/>
+      <w:r>
+        <w:rPr>
+          <w:i/>
+          <w:iCs/>
+          <w:color w:val="555555"/>
+          <w:sz w:val="18"/>
+          <w:szCs w:val="18"/>
+        </w:rPr>
+        <w:t xml:space="preserve">  Alger, Algérie</w:t>
       </w:r>
       <w:r>
         <w:rPr>
@@ -2156,7 +1556,92 @@
           <w:sz w:val="18"/>
           <w:szCs w:val="18"/>
         </w:rPr>
-        <w:t xml:space="preserve">     juil. 2016 — mars 2019</w:t>
+        <w:t xml:space="preserve">     déc. 2019 — fév. 2023</w:t>
+      </w:r>
+    </w:p>
+    <w:p>
+      <w:pPr>
+        <w:spacing w:before="40" w:after="40"/>
+        <w:ind w:left="360" w:hanging="240"/>
+      </w:pPr>
+      <w:proofErr w:type="gramStart"/>
+      <w:r>
+        <w:rPr>
+          <w:b/>
+          <w:bCs/>
+          <w:color w:val="2E6EA6"/>
+          <w:sz w:val="19"/>
+          <w:szCs w:val="19"/>
+        </w:rPr>
+        <w:t xml:space="preserve">▸  </w:t>
+      </w:r>
+      <w:r>
+        <w:rPr>
+          <w:sz w:val="19"/>
+          <w:szCs w:val="19"/>
+        </w:rPr>
+        <w:t>Diriger</w:t>
+      </w:r>
+      <w:proofErr w:type="gramEnd"/>
+      <w:r>
+        <w:rPr>
+          <w:sz w:val="19"/>
+          <w:szCs w:val="19"/>
+        </w:rPr>
+        <w:t xml:space="preserve"> une équipe de 5 à 6 développeurs spécialisés Odoo et superviser les projets web</w:t>
+      </w:r>
+    </w:p>
+    <w:p>
+      <w:pPr>
+        <w:spacing w:before="40" w:after="40"/>
+        <w:ind w:left="360" w:hanging="240"/>
+      </w:pPr>
+      <w:proofErr w:type="gramStart"/>
+      <w:r>
+        <w:rPr>
+          <w:b/>
+          <w:bCs/>
+          <w:color w:val="2E6EA6"/>
+          <w:sz w:val="19"/>
+          <w:szCs w:val="19"/>
+        </w:rPr>
+        <w:t xml:space="preserve">▸  </w:t>
+      </w:r>
+      <w:r>
+        <w:rPr>
+          <w:sz w:val="19"/>
+          <w:szCs w:val="19"/>
+        </w:rPr>
+        <w:t>Développer</w:t>
+      </w:r>
+      <w:proofErr w:type="gramEnd"/>
+      <w:r>
+        <w:rPr>
+          <w:sz w:val="19"/>
+          <w:szCs w:val="19"/>
+        </w:rPr>
+        <w:t xml:space="preserve"> et intégrer des solutions personnalisées aux besoins de l'entreprise</w:t>
+      </w:r>
+    </w:p>
+    <w:p>
+      <w:pPr>
+        <w:spacing w:before="40"/>
+      </w:pPr>
+    </w:p>
+    <w:p>
+      <w:pPr>
+        <w:spacing w:before="60" w:after="20"/>
+        <w:ind w:left="360"/>
+      </w:pPr>
+      <w:r>
+        <w:rPr>
+          <w:b/>
+          <w:bCs/>
+          <w:color w:val="1A3C5E"/>
+          <w:sz w:val="19"/>
+          <w:szCs w:val="19"/>
+        </w:rPr>
+        <w:t>Projets clés livrés :</w:t>
       </w:r>
     </w:p>
     <w:p>
@@ -2168,11 +1653,21 @@
         <w:rPr>
           <w:b/>
           <w:bCs/>
+          <w:color w:val="E8840A"/>
+          <w:sz w:val="19"/>
+          <w:szCs w:val="19"/>
+        </w:rPr>
+        <w:t xml:space="preserve">◆ </w:t>
+      </w:r>
+      <w:r>
+        <w:rPr>
+          <w:b/>
+          <w:bCs/>
           <w:color w:val="1A3C5E"/>
           <w:sz w:val="19"/>
           <w:szCs w:val="19"/>
         </w:rPr>
-        <w:t>Solution de Gestion d'Agence de Voyage</w:t>
+        <w:t>Solution de Gestion du Transport de Marchandises</w:t>
       </w:r>
     </w:p>
     <w:p>
@@ -2186,7 +1681,7 @@
           <w:sz w:val="18"/>
           <w:szCs w:val="18"/>
         </w:rPr>
-        <w:t>–  Solution ERP complète pour agences de voyages :</w:t>
+        <w:t>–  Solution ERP complète couvrant l'ensemble du cycle fret ferroviaire :</w:t>
       </w:r>
     </w:p>
     <w:p>
@@ -2194,13 +1689,23 @@
         <w:spacing w:before="20" w:after="20"/>
         <w:ind w:left="960" w:hanging="240"/>
       </w:pPr>
-      <w:r>
-        <w:rPr>
-          <w:color w:val="555555"/>
-          <w:sz w:val="18"/>
-          <w:szCs w:val="18"/>
-        </w:rPr>
-        <w:t>·  Gestion des fournisseurs (hôtels, transporteurs, guides) et des circuits / voyages organisés</w:t>
+      <w:proofErr w:type="gramStart"/>
+      <w:r>
+        <w:rPr>
+          <w:color w:val="555555"/>
+          <w:sz w:val="18"/>
+          <w:szCs w:val="18"/>
+        </w:rPr>
+        <w:t>·  Référentiel</w:t>
+      </w:r>
+      <w:proofErr w:type="gramEnd"/>
+      <w:r>
+        <w:rPr>
+          <w:color w:val="555555"/>
+          <w:sz w:val="18"/>
+          <w:szCs w:val="18"/>
+        </w:rPr>
+        <w:t xml:space="preserve"> produits : catalogue des marchandises (nature, prix, contraintes) pour sélectionner le type de wagon adapté</w:t>
       </w:r>
     </w:p>
     <w:p>
@@ -2208,13 +1713,23 @@
         <w:spacing w:before="20" w:after="20"/>
         <w:ind w:left="960" w:hanging="240"/>
       </w:pPr>
-      <w:r>
-        <w:rPr>
-          <w:color w:val="555555"/>
-          <w:sz w:val="18"/>
-          <w:szCs w:val="18"/>
-        </w:rPr>
-        <w:t>·  Gestion des réservations, devis et contrats clients avec suivi des paiements et acomptes</w:t>
+      <w:proofErr w:type="gramStart"/>
+      <w:r>
+        <w:rPr>
+          <w:color w:val="555555"/>
+          <w:sz w:val="18"/>
+          <w:szCs w:val="18"/>
+        </w:rPr>
+        <w:t>·  Gestion</w:t>
+      </w:r>
+      <w:proofErr w:type="gramEnd"/>
+      <w:r>
+        <w:rPr>
+          <w:color w:val="555555"/>
+          <w:sz w:val="18"/>
+          <w:szCs w:val="18"/>
+        </w:rPr>
+        <w:t xml:space="preserve"> des déclarations d'expédition (équivalent bon de commande fret)</w:t>
       </w:r>
     </w:p>
     <w:p>
@@ -2222,13 +1737,23 @@
         <w:spacing w:before="20" w:after="20"/>
         <w:ind w:left="960" w:hanging="240"/>
       </w:pPr>
-      <w:r>
-        <w:rPr>
-          <w:color w:val="555555"/>
-          <w:sz w:val="18"/>
-          <w:szCs w:val="18"/>
-        </w:rPr>
-        <w:t>·  Intégration email Bedsonline : réception et traitement automatique des confirmations de réservation d'hôtel dans Odoo</w:t>
+      <w:proofErr w:type="gramStart"/>
+      <w:r>
+        <w:rPr>
+          <w:color w:val="555555"/>
+          <w:sz w:val="18"/>
+          <w:szCs w:val="18"/>
+        </w:rPr>
+        <w:t>·  Gestion</w:t>
+      </w:r>
+      <w:proofErr w:type="gramEnd"/>
+      <w:r>
+        <w:rPr>
+          <w:color w:val="555555"/>
+          <w:sz w:val="18"/>
+          <w:szCs w:val="18"/>
+        </w:rPr>
+        <w:t xml:space="preserve"> des conventions tarifaires clients et remises commerciales</w:t>
       </w:r>
     </w:p>
     <w:p>
@@ -2236,13 +1761,23 @@
         <w:spacing w:before="20" w:after="20"/>
         <w:ind w:left="960" w:hanging="240"/>
       </w:pPr>
-      <w:r>
-        <w:rPr>
-          <w:color w:val="555555"/>
-          <w:sz w:val="18"/>
-          <w:szCs w:val="18"/>
-        </w:rPr>
-        <w:t>·  Parsing des fichiers Amadeus : import et création automatique de devis et réservations de vols dans Odoo</w:t>
+      <w:proofErr w:type="gramStart"/>
+      <w:r>
+        <w:rPr>
+          <w:color w:val="555555"/>
+          <w:sz w:val="18"/>
+          <w:szCs w:val="18"/>
+        </w:rPr>
+        <w:t>·  Facturation</w:t>
+      </w:r>
+      <w:proofErr w:type="gramEnd"/>
+      <w:r>
+        <w:rPr>
+          <w:color w:val="555555"/>
+          <w:sz w:val="18"/>
+          <w:szCs w:val="18"/>
+        </w:rPr>
+        <w:t xml:space="preserve"> client automatisée en fin de cycle</w:t>
       </w:r>
     </w:p>
     <w:p>
@@ -2250,13 +1785,23 @@
         <w:spacing w:before="20" w:after="20"/>
         <w:ind w:left="960" w:hanging="240"/>
       </w:pPr>
-      <w:r>
-        <w:rPr>
-          <w:color w:val="555555"/>
-          <w:sz w:val="18"/>
-          <w:szCs w:val="18"/>
-        </w:rPr>
-        <w:t>·  Facturation clients et gestion de la trésorerie agence</w:t>
+      <w:proofErr w:type="gramStart"/>
+      <w:r>
+        <w:rPr>
+          <w:color w:val="555555"/>
+          <w:sz w:val="18"/>
+          <w:szCs w:val="18"/>
+        </w:rPr>
+        <w:t>·  Transfert</w:t>
+      </w:r>
+      <w:proofErr w:type="gramEnd"/>
+      <w:r>
+        <w:rPr>
+          <w:color w:val="555555"/>
+          <w:sz w:val="18"/>
+          <w:szCs w:val="18"/>
+        </w:rPr>
+        <w:t xml:space="preserve"> instantané des documents entre gares (expéditeur → destinataire) via Odoo web, remplaçant l'échange physique de documents</w:t>
       </w:r>
     </w:p>
     <w:p>
@@ -2266,24 +1811,13 @@
       </w:pPr>
       <w:r>
         <w:rPr>
-          <w:rFonts w:ascii="Cambria Math" w:hAnsi="Cambria Math" w:cs="Cambria Math"/>
           <w:b/>
           <w:bCs/>
           <w:color w:val="E8840A"/>
           <w:sz w:val="19"/>
           <w:szCs w:val="19"/>
         </w:rPr>
-        <w:t>◆</w:t>
-      </w:r>
-      <w:r>
-        <w:rPr>
-          <w:b/>
-          <w:bCs/>
-          <w:color w:val="E8840A"/>
-          <w:sz w:val="19"/>
-          <w:szCs w:val="19"/>
-        </w:rPr>
-        <w:t xml:space="preserve"> </w:t>
+        <w:t xml:space="preserve">◆ </w:t>
       </w:r>
       <w:r>
         <w:rPr>
@@ -2293,7 +1827,7 @@
           <w:sz w:val="19"/>
           <w:szCs w:val="19"/>
         </w:rPr>
-        <w:t>Solution de Gestion de Location de Voiture</w:t>
+        <w:t>Solution de Gestion des Billets Voyageurs</w:t>
       </w:r>
     </w:p>
     <w:p>
@@ -2307,7 +1841,7 @@
           <w:sz w:val="18"/>
           <w:szCs w:val="18"/>
         </w:rPr>
-        <w:t>–  Solution complète de gestion de flotte et de location :</w:t>
+        <w:t>–  Solution billettique complète couvrant l'ensemble du cycle voyageur :</w:t>
       </w:r>
     </w:p>
     <w:p>
@@ -2315,13 +1849,23 @@
         <w:spacing w:before="20" w:after="20"/>
         <w:ind w:left="960" w:hanging="240"/>
       </w:pPr>
-      <w:r>
-        <w:rPr>
-          <w:color w:val="555555"/>
-          <w:sz w:val="18"/>
-          <w:szCs w:val="18"/>
-        </w:rPr>
-        <w:t>·  Gestion du parc de véhicules : fiches techniques, disponibilité, kilométrage et maintenance</w:t>
+      <w:proofErr w:type="gramStart"/>
+      <w:r>
+        <w:rPr>
+          <w:color w:val="555555"/>
+          <w:sz w:val="18"/>
+          <w:szCs w:val="18"/>
+        </w:rPr>
+        <w:t>·  Référentiel</w:t>
+      </w:r>
+      <w:proofErr w:type="gramEnd"/>
+      <w:r>
+        <w:rPr>
+          <w:color w:val="555555"/>
+          <w:sz w:val="18"/>
+          <w:szCs w:val="18"/>
+        </w:rPr>
+        <w:t xml:space="preserve"> ferroviaire : gestion des trains, types de trains, gares de passage, relations (origines/destinations) et calendriers de circulation</w:t>
       </w:r>
     </w:p>
     <w:p>
@@ -2329,13 +1873,23 @@
         <w:spacing w:before="20" w:after="20"/>
         <w:ind w:left="960" w:hanging="240"/>
       </w:pPr>
-      <w:r>
-        <w:rPr>
-          <w:color w:val="555555"/>
-          <w:sz w:val="18"/>
-          <w:szCs w:val="18"/>
-        </w:rPr>
-        <w:t>·  Contrats de location : réservation, remise/restitution du véhicule, état des lieux</w:t>
+      <w:proofErr w:type="gramStart"/>
+      <w:r>
+        <w:rPr>
+          <w:color w:val="555555"/>
+          <w:sz w:val="18"/>
+          <w:szCs w:val="18"/>
+        </w:rPr>
+        <w:t>·  Gestion</w:t>
+      </w:r>
+      <w:proofErr w:type="gramEnd"/>
+      <w:r>
+        <w:rPr>
+          <w:color w:val="555555"/>
+          <w:sz w:val="18"/>
+          <w:szCs w:val="18"/>
+        </w:rPr>
+        <w:t xml:space="preserve"> des profils voyageurs et tarification différenciée (remises par catégorie : étudiant, retraité, abonné…)</w:t>
       </w:r>
     </w:p>
     <w:p>
@@ -2343,39 +1897,48 @@
         <w:spacing w:before="20" w:after="20"/>
         <w:ind w:left="960" w:hanging="240"/>
       </w:pPr>
-      <w:r>
-        <w:rPr>
-          <w:color w:val="555555"/>
-          <w:sz w:val="18"/>
-          <w:szCs w:val="18"/>
-        </w:rPr>
-        <w:t>·  Gestion des cautions, amendes et sinistres</w:t>
+      <w:proofErr w:type="gramStart"/>
+      <w:r>
+        <w:rPr>
+          <w:color w:val="555555"/>
+          <w:sz w:val="18"/>
+          <w:szCs w:val="18"/>
+        </w:rPr>
+        <w:t>·  Vente</w:t>
+      </w:r>
+      <w:proofErr w:type="gramEnd"/>
+      <w:r>
+        <w:rPr>
+          <w:color w:val="555555"/>
+          <w:sz w:val="18"/>
+          <w:szCs w:val="18"/>
+        </w:rPr>
+        <w:t xml:space="preserve"> et émission de billets en gare avec synchronisation bidirectionnelle : remontée des données de ventes vers le national, déploiement des configurations (tarifs, trains, calendriers) du national vers les gares</w:t>
       </w:r>
     </w:p>
     <w:p>
       <w:pPr>
         <w:spacing w:before="20" w:after="20"/>
         <w:ind w:left="960" w:hanging="240"/>
-        <w:rPr>
-          <w:color w:val="555555"/>
-          <w:sz w:val="18"/>
-          <w:szCs w:val="18"/>
-        </w:rPr>
-      </w:pPr>
-      <w:r>
-        <w:rPr>
-          <w:color w:val="555555"/>
-          <w:sz w:val="18"/>
-          <w:szCs w:val="18"/>
-        </w:rPr>
-        <w:t>·  Facturation clients et suivi des paiements</w:t>
-      </w:r>
-    </w:p>
-    <w:p>
-      <w:pPr>
-        <w:spacing w:before="20" w:after="20"/>
-        <w:ind w:left="960" w:hanging="240"/>
-      </w:pPr>
+      </w:pPr>
+      <w:proofErr w:type="gramStart"/>
+      <w:r>
+        <w:rPr>
+          <w:color w:val="555555"/>
+          <w:sz w:val="18"/>
+          <w:szCs w:val="18"/>
+        </w:rPr>
+        <w:t>·  Tableaux</w:t>
+      </w:r>
+      <w:proofErr w:type="gramEnd"/>
+      <w:r>
+        <w:rPr>
+          <w:color w:val="555555"/>
+          <w:sz w:val="18"/>
+          <w:szCs w:val="18"/>
+        </w:rPr>
+        <w:t xml:space="preserve"> de bord analytiques multi-niveaux : ventes par gare, par région et par relation (origine/destination)</w:t>
+      </w:r>
     </w:p>
     <w:p>
       <w:pPr>
@@ -2384,25 +1947,13 @@
       </w:pPr>
       <w:r>
         <w:rPr>
-          <w:rFonts w:ascii="Cambria Math" w:hAnsi="Cambria Math" w:cs="Cambria Math"/>
           <w:b/>
           <w:bCs/>
           <w:color w:val="E8840A"/>
           <w:sz w:val="19"/>
           <w:szCs w:val="19"/>
         </w:rPr>
-        <w:lastRenderedPageBreak/>
-        <w:t>◆</w:t>
-      </w:r>
-      <w:r>
-        <w:rPr>
-          <w:b/>
-          <w:bCs/>
-          <w:color w:val="E8840A"/>
-          <w:sz w:val="19"/>
-          <w:szCs w:val="19"/>
-        </w:rPr>
-        <w:t xml:space="preserve"> </w:t>
+        <w:t xml:space="preserve">◆ </w:t>
       </w:r>
       <w:r>
         <w:rPr>
@@ -2412,7 +1963,7 @@
           <w:sz w:val="19"/>
           <w:szCs w:val="19"/>
         </w:rPr>
-        <w:t>Solution Import / Export</w:t>
+        <w:t>Solution d'Archivage des Documents</w:t>
       </w:r>
     </w:p>
     <w:p>
@@ -2426,63 +1977,7 @@
           <w:sz w:val="18"/>
           <w:szCs w:val="18"/>
         </w:rPr>
-        <w:t>–  Solution ERP dédiée aux opérations de commerce international :</w:t>
-      </w:r>
-    </w:p>
-    <w:p>
-      <w:pPr>
-        <w:spacing w:before="20" w:after="20"/>
-        <w:ind w:left="960" w:hanging="240"/>
-      </w:pPr>
-      <w:r>
-        <w:rPr>
-          <w:color w:val="555555"/>
-          <w:sz w:val="18"/>
-          <w:szCs w:val="18"/>
-        </w:rPr>
-        <w:t>·  Gestion des manifests de chargement et des connaissements (bill of lading)</w:t>
-      </w:r>
-    </w:p>
-    <w:p>
-      <w:pPr>
-        <w:spacing w:before="20" w:after="20"/>
-        <w:ind w:left="960" w:hanging="240"/>
-      </w:pPr>
-      <w:r>
-        <w:rPr>
-          <w:color w:val="555555"/>
-          <w:sz w:val="18"/>
-          <w:szCs w:val="18"/>
-        </w:rPr>
-        <w:t>·  Suivi des expéditions et gestion des transitaires</w:t>
-      </w:r>
-    </w:p>
-    <w:p>
-      <w:pPr>
-        <w:spacing w:before="20" w:after="20"/>
-        <w:ind w:left="960" w:hanging="240"/>
-      </w:pPr>
-      <w:r>
-        <w:rPr>
-          <w:color w:val="555555"/>
-          <w:sz w:val="18"/>
-          <w:szCs w:val="18"/>
-        </w:rPr>
-        <w:t>·  Gestion des formalités douanières et documents réglementaires</w:t>
-      </w:r>
-    </w:p>
-    <w:p>
-      <w:pPr>
-        <w:spacing w:before="20" w:after="20"/>
-        <w:ind w:left="960" w:hanging="240"/>
-      </w:pPr>
-      <w:r>
-        <w:rPr>
-          <w:color w:val="555555"/>
-          <w:sz w:val="18"/>
-          <w:szCs w:val="18"/>
-        </w:rPr>
-        <w:t>·  Facturation en devises et gestion des écarts de change</w:t>
+        <w:t>–  Système d'archivage et gestion des documents internes</w:t>
       </w:r>
     </w:p>
     <w:p>
@@ -2492,118 +1987,101 @@
       </w:pPr>
       <w:r>
         <w:rPr>
-          <w:rFonts w:ascii="Cambria Math" w:hAnsi="Cambria Math" w:cs="Cambria Math"/>
           <w:b/>
           <w:bCs/>
           <w:color w:val="E8840A"/>
           <w:sz w:val="19"/>
           <w:szCs w:val="19"/>
         </w:rPr>
-        <w:t>◆</w:t>
+        <w:t xml:space="preserve">◆ </w:t>
+      </w:r>
+      <w:r>
+        <w:rPr>
+          <w:b/>
+          <w:bCs/>
+          <w:color w:val="1A3C5E"/>
+          <w:sz w:val="19"/>
+          <w:szCs w:val="19"/>
+        </w:rPr>
+        <w:t>Outil de Synthèse des Incidents Ferroviaires</w:t>
+      </w:r>
+    </w:p>
+    <w:p>
+      <w:pPr>
+        <w:spacing w:before="20" w:after="20"/>
+        <w:ind w:left="720" w:hanging="240"/>
+      </w:pPr>
+      <w:r>
+        <w:rPr>
+          <w:color w:val="555555"/>
+          <w:sz w:val="18"/>
+          <w:szCs w:val="18"/>
+        </w:rPr>
+        <w:t>–  Remplacement du suivi par fichiers Excel par des tableaux de bord Odoo interactifs : meilleure visibilité, priorisation des incidents et aide à la décision en temps réel</w:t>
+      </w:r>
+    </w:p>
+    <w:p>
+      <w:pPr>
+        <w:spacing w:before="200" w:after="30"/>
+        <w:rPr>
+          <w:b/>
+          <w:bCs/>
+          <w:color w:val="1A3C5E"/>
+          <w:sz w:val="21"/>
+          <w:szCs w:val="21"/>
+        </w:rPr>
+      </w:pPr>
+    </w:p>
+    <w:p>
+      <w:pPr>
+        <w:spacing w:before="200" w:after="30"/>
+      </w:pPr>
+      <w:r>
+        <w:rPr>
+          <w:b/>
+          <w:bCs/>
+          <w:color w:val="1A3C5E"/>
+          <w:sz w:val="21"/>
+          <w:szCs w:val="21"/>
+        </w:rPr>
+        <w:t>Ingénieur Informatique — Consultant ERP &amp; SI</w:t>
+      </w:r>
+    </w:p>
+    <w:p>
+      <w:pPr>
+        <w:spacing w:after="60"/>
+      </w:pPr>
+      <w:proofErr w:type="gramStart"/>
+      <w:r>
+        <w:rPr>
+          <w:i/>
+          <w:iCs/>
+          <w:color w:val="555555"/>
+          <w:sz w:val="18"/>
+          <w:szCs w:val="18"/>
+        </w:rPr>
+        <w:t>AASYS  •</w:t>
+      </w:r>
+      <w:proofErr w:type="gramEnd"/>
+      <w:r>
+        <w:rPr>
+          <w:i/>
+          <w:iCs/>
+          <w:color w:val="555555"/>
+          <w:sz w:val="18"/>
+          <w:szCs w:val="18"/>
+        </w:rPr>
+        <w:t xml:space="preserve">  Alger, Algérie</w:t>
       </w:r>
       <w:r>
         <w:rPr>
           <w:b/>
           <w:bCs/>
           <w:color w:val="E8840A"/>
-          <w:sz w:val="19"/>
-          <w:szCs w:val="19"/>
-        </w:rPr>
-        <w:t xml:space="preserve"> </w:t>
-      </w:r>
-      <w:r>
-        <w:rPr>
-          <w:b/>
-          <w:bCs/>
-          <w:color w:val="1A3C5E"/>
-          <w:sz w:val="19"/>
-          <w:szCs w:val="19"/>
-        </w:rPr>
-        <w:t>Solution de Gestion d'École Privée</w:t>
-      </w:r>
-    </w:p>
-    <w:p>
-      <w:pPr>
-        <w:spacing w:before="20" w:after="20"/>
-        <w:ind w:left="720" w:hanging="240"/>
-      </w:pPr>
-      <w:r>
-        <w:rPr>
-          <w:color w:val="555555"/>
-          <w:sz w:val="18"/>
-          <w:szCs w:val="18"/>
-        </w:rPr>
-        <w:t>–  Solution de gestion scolaire complète :</w:t>
-      </w:r>
-    </w:p>
-    <w:p>
-      <w:pPr>
-        <w:spacing w:before="20" w:after="20"/>
-        <w:ind w:left="960" w:hanging="240"/>
-      </w:pPr>
-      <w:r>
-        <w:rPr>
-          <w:color w:val="555555"/>
-          <w:sz w:val="18"/>
-          <w:szCs w:val="18"/>
-        </w:rPr>
-        <w:t>·  Gestion des inscriptions, dossiers élèves et profils enseignants</w:t>
-      </w:r>
-    </w:p>
-    <w:p>
-      <w:pPr>
-        <w:spacing w:before="20" w:after="20"/>
-        <w:ind w:left="960" w:hanging="240"/>
-      </w:pPr>
-      <w:r>
-        <w:rPr>
-          <w:color w:val="555555"/>
-          <w:sz w:val="18"/>
-          <w:szCs w:val="18"/>
-        </w:rPr>
-        <w:t>·  Planification des emplois du temps et affectation des classes</w:t>
-      </w:r>
-    </w:p>
-    <w:p>
-      <w:pPr>
-        <w:spacing w:before="20" w:after="20"/>
-        <w:ind w:left="960" w:hanging="240"/>
-      </w:pPr>
-      <w:r>
-        <w:rPr>
-          <w:color w:val="555555"/>
-          <w:sz w:val="18"/>
-          <w:szCs w:val="18"/>
-        </w:rPr>
-        <w:t>·  Suivi des présences et gestion des absences</w:t>
-      </w:r>
-    </w:p>
-    <w:p>
-      <w:pPr>
-        <w:spacing w:before="20" w:after="20"/>
-        <w:ind w:left="960" w:hanging="240"/>
-      </w:pPr>
-      <w:r>
-        <w:rPr>
-          <w:color w:val="555555"/>
-          <w:sz w:val="18"/>
-          <w:szCs w:val="18"/>
-        </w:rPr>
-        <w:t>·  Gestion des examens, notation et édition des bulletins de notes</w:t>
-      </w:r>
-    </w:p>
-    <w:p>
-      <w:pPr>
-        <w:spacing w:before="20" w:after="20"/>
-        <w:ind w:left="960" w:hanging="240"/>
-      </w:pPr>
-      <w:r>
-        <w:rPr>
-          <w:color w:val="555555"/>
-          <w:sz w:val="18"/>
-          <w:szCs w:val="18"/>
-        </w:rPr>
-        <w:t>·  Facturation des frais de scolarité et suivi des paiements</w:t>
+          <w:sz w:val="18"/>
+          <w:szCs w:val="18"/>
+        </w:rPr>
+        <w:t xml:space="preserve">     mars 2019 — déc. 2019</w:t>
       </w:r>
     </w:p>
     <w:p>
@@ -2613,24 +2091,13 @@
       </w:pPr>
       <w:r>
         <w:rPr>
-          <w:rFonts w:ascii="Cambria Math" w:hAnsi="Cambria Math" w:cs="Cambria Math"/>
           <w:b/>
           <w:bCs/>
           <w:color w:val="E8840A"/>
           <w:sz w:val="19"/>
           <w:szCs w:val="19"/>
         </w:rPr>
-        <w:t>◆</w:t>
-      </w:r>
-      <w:r>
-        <w:rPr>
-          <w:b/>
-          <w:bCs/>
-          <w:color w:val="E8840A"/>
-          <w:sz w:val="19"/>
-          <w:szCs w:val="19"/>
-        </w:rPr>
-        <w:t xml:space="preserve"> </w:t>
+        <w:t xml:space="preserve">◆ </w:t>
       </w:r>
       <w:r>
         <w:rPr>
@@ -2640,21 +2107,79 @@
           <w:sz w:val="19"/>
           <w:szCs w:val="19"/>
         </w:rPr>
-        <w:t>Personnalisation de modules Odoo standard</w:t>
-      </w:r>
-    </w:p>
-    <w:p>
-      <w:pPr>
-        <w:spacing w:before="20" w:after="20"/>
-        <w:ind w:left="720" w:hanging="240"/>
-      </w:pPr>
-      <w:r>
-        <w:rPr>
-          <w:color w:val="555555"/>
-          <w:sz w:val="18"/>
-          <w:szCs w:val="18"/>
-        </w:rPr>
-        <w:t>–  CRM, Vente, Achat, Stock, Facturation, Comptabilité, RH &amp; Paie</w:t>
+        <w:t>Portage de modules Odoo vers l'ERP Open-Prod :</w:t>
+      </w:r>
+    </w:p>
+    <w:p>
+      <w:pPr>
+        <w:spacing w:before="20" w:after="20"/>
+        <w:ind w:left="960" w:hanging="240"/>
+      </w:pPr>
+      <w:proofErr w:type="gramStart"/>
+      <w:r>
+        <w:rPr>
+          <w:color w:val="555555"/>
+          <w:sz w:val="18"/>
+          <w:szCs w:val="18"/>
+        </w:rPr>
+        <w:t>·  Analyse</w:t>
+      </w:r>
+      <w:proofErr w:type="gramEnd"/>
+      <w:r>
+        <w:rPr>
+          <w:color w:val="555555"/>
+          <w:sz w:val="18"/>
+          <w:szCs w:val="18"/>
+        </w:rPr>
+        <w:t xml:space="preserve"> et adaptation du code source des modules Odoo (RH, Paie) pour les rendre compatibles et fonctionnels sur Open-Prod</w:t>
+      </w:r>
+    </w:p>
+    <w:p>
+      <w:pPr>
+        <w:spacing w:before="20" w:after="20"/>
+        <w:ind w:left="960" w:hanging="240"/>
+      </w:pPr>
+      <w:proofErr w:type="gramStart"/>
+      <w:r>
+        <w:rPr>
+          <w:color w:val="555555"/>
+          <w:sz w:val="18"/>
+          <w:szCs w:val="18"/>
+        </w:rPr>
+        <w:t>·  Mapping</w:t>
+      </w:r>
+      <w:proofErr w:type="gramEnd"/>
+      <w:r>
+        <w:rPr>
+          <w:color w:val="555555"/>
+          <w:sz w:val="18"/>
+          <w:szCs w:val="18"/>
+        </w:rPr>
+        <w:t xml:space="preserve"> des modèles de données, ajustement des vues et des workflows métier entre les deux plateformes</w:t>
+      </w:r>
+    </w:p>
+    <w:p>
+      <w:pPr>
+        <w:spacing w:before="20" w:after="20"/>
+        <w:ind w:left="960" w:hanging="240"/>
+      </w:pPr>
+      <w:proofErr w:type="gramStart"/>
+      <w:r>
+        <w:rPr>
+          <w:color w:val="555555"/>
+          <w:sz w:val="18"/>
+          <w:szCs w:val="18"/>
+        </w:rPr>
+        <w:t>·  Tests</w:t>
+      </w:r>
+      <w:proofErr w:type="gramEnd"/>
+      <w:r>
+        <w:rPr>
+          <w:color w:val="555555"/>
+          <w:sz w:val="18"/>
+          <w:szCs w:val="18"/>
+        </w:rPr>
+        <w:t xml:space="preserve"> de non-régression et validation fonctionnelle avec les équipes métier</w:t>
       </w:r>
     </w:p>
     <w:p>
@@ -2664,25 +2189,15 @@
       </w:pPr>
       <w:r>
         <w:rPr>
-          <w:rFonts w:ascii="Cambria Math" w:hAnsi="Cambria Math" w:cs="Cambria Math"/>
           <w:b/>
           <w:bCs/>
           <w:color w:val="E8840A"/>
           <w:sz w:val="19"/>
           <w:szCs w:val="19"/>
         </w:rPr>
-        <w:t>◆</w:t>
-      </w:r>
-      <w:r>
-        <w:rPr>
-          <w:b/>
-          <w:bCs/>
-          <w:color w:val="E8840A"/>
-          <w:sz w:val="19"/>
-          <w:szCs w:val="19"/>
-        </w:rPr>
-        <w:t xml:space="preserve"> </w:t>
-      </w:r>
+        <w:t xml:space="preserve">◆ </w:t>
+      </w:r>
+      <w:proofErr w:type="spellStart"/>
       <w:r>
         <w:rPr>
           <w:b/>
@@ -2691,142 +2206,226 @@
           <w:sz w:val="19"/>
           <w:szCs w:val="19"/>
         </w:rPr>
-        <w:t>APIs pour applications tierces</w:t>
-      </w:r>
-    </w:p>
-    <w:p>
-      <w:pPr>
-        <w:spacing w:before="20" w:after="20"/>
-        <w:ind w:left="720" w:hanging="240"/>
-      </w:pPr>
-      <w:r>
-        <w:rPr>
-          <w:color w:val="555555"/>
-          <w:sz w:val="18"/>
-          <w:szCs w:val="18"/>
-        </w:rPr>
-        <w:t>–  Accès et synchronisation des données Odoo via APIs REST</w:t>
+        <w:t>Parser</w:t>
+      </w:r>
+      <w:proofErr w:type="spellEnd"/>
+      <w:r>
+        <w:rPr>
+          <w:b/>
+          <w:bCs/>
+          <w:color w:val="1A3C5E"/>
+          <w:sz w:val="19"/>
+          <w:szCs w:val="19"/>
+        </w:rPr>
+        <w:t xml:space="preserve"> des factures PDF fournisseurs :</w:t>
+      </w:r>
+    </w:p>
+    <w:p>
+      <w:pPr>
+        <w:spacing w:before="20" w:after="20"/>
+        <w:ind w:left="960" w:hanging="240"/>
+      </w:pPr>
+      <w:proofErr w:type="gramStart"/>
+      <w:r>
+        <w:rPr>
+          <w:color w:val="555555"/>
+          <w:sz w:val="18"/>
+          <w:szCs w:val="18"/>
+        </w:rPr>
+        <w:t>·  Développement</w:t>
+      </w:r>
+      <w:proofErr w:type="gramEnd"/>
+      <w:r>
+        <w:rPr>
+          <w:color w:val="555555"/>
+          <w:sz w:val="18"/>
+          <w:szCs w:val="18"/>
+        </w:rPr>
+        <w:t xml:space="preserve"> d'un moteur d'analyse de fichiers PDF pour extraire automatiquement les données de facturation (références, montants, fournisseurs, TVA…)</w:t>
+      </w:r>
+    </w:p>
+    <w:p>
+      <w:pPr>
+        <w:spacing w:before="20" w:after="20"/>
+        <w:ind w:left="960" w:hanging="240"/>
+      </w:pPr>
+      <w:proofErr w:type="gramStart"/>
+      <w:r>
+        <w:rPr>
+          <w:color w:val="555555"/>
+          <w:sz w:val="18"/>
+          <w:szCs w:val="18"/>
+        </w:rPr>
+        <w:t>·  Création</w:t>
+      </w:r>
+      <w:proofErr w:type="gramEnd"/>
+      <w:r>
+        <w:rPr>
+          <w:color w:val="555555"/>
+          <w:sz w:val="18"/>
+          <w:szCs w:val="18"/>
+        </w:rPr>
+        <w:t xml:space="preserve"> automatique des factures correspondantes dans Odoo, éliminant la ressaisie manuelle</w:t>
+      </w:r>
+    </w:p>
+    <w:p>
+      <w:pPr>
+        <w:spacing w:before="20" w:after="20"/>
+        <w:ind w:left="960" w:hanging="240"/>
+      </w:pPr>
+      <w:proofErr w:type="gramStart"/>
+      <w:r>
+        <w:rPr>
+          <w:color w:val="555555"/>
+          <w:sz w:val="18"/>
+          <w:szCs w:val="18"/>
+        </w:rPr>
+        <w:t>·  Taux</w:t>
+      </w:r>
+      <w:proofErr w:type="gramEnd"/>
+      <w:r>
+        <w:rPr>
+          <w:color w:val="555555"/>
+          <w:sz w:val="18"/>
+          <w:szCs w:val="18"/>
+        </w:rPr>
+        <w:t xml:space="preserve"> de fiabilité d'extraction supérieur à 99% atteint en production</w:t>
       </w:r>
     </w:p>
     <w:p>
       <w:pPr>
         <w:spacing w:before="80" w:after="20"/>
         <w:ind w:left="360"/>
-      </w:pPr>
-      <w:r>
-        <w:rPr>
-          <w:rFonts w:ascii="Cambria Math" w:hAnsi="Cambria Math" w:cs="Cambria Math"/>
+        <w:rPr>
+          <w:b/>
+          <w:bCs/>
+          <w:color w:val="1A3C5E"/>
+          <w:sz w:val="19"/>
+          <w:szCs w:val="19"/>
+        </w:rPr>
+      </w:pPr>
+      <w:r>
+        <w:rPr>
           <w:b/>
           <w:bCs/>
           <w:color w:val="E8840A"/>
           <w:sz w:val="19"/>
           <w:szCs w:val="19"/>
         </w:rPr>
-        <w:t>◆</w:t>
-      </w:r>
-      <w:r>
-        <w:rPr>
-          <w:b/>
-          <w:bCs/>
-          <w:color w:val="E8840A"/>
+        <w:t xml:space="preserve">◆ </w:t>
+      </w:r>
+      <w:r>
+        <w:rPr>
+          <w:b/>
+          <w:bCs/>
+          <w:color w:val="1A3C5E"/>
+          <w:sz w:val="19"/>
+          <w:szCs w:val="19"/>
+        </w:rPr>
+        <w:t xml:space="preserve">Solution ERP </w:t>
+      </w:r>
+      <w:r>
+        <w:rPr>
+          <w:b/>
+          <w:bCs/>
+          <w:color w:val="1A3C5E"/>
+          <w:sz w:val="19"/>
+          <w:szCs w:val="19"/>
+        </w:rPr>
+        <w:t xml:space="preserve">(domaine </w:t>
+      </w:r>
+      <w:r>
+        <w:rPr>
+          <w:b/>
+          <w:bCs/>
+          <w:color w:val="1A3C5E"/>
+          <w:sz w:val="19"/>
+          <w:szCs w:val="19"/>
+        </w:rPr>
+        <w:t>Médicale</w:t>
+      </w:r>
+      <w:r>
+        <w:rPr>
+          <w:b/>
+          <w:bCs/>
+          <w:color w:val="1A3C5E"/>
+          <w:sz w:val="19"/>
+          <w:szCs w:val="19"/>
+        </w:rPr>
+        <w:t>)</w:t>
+      </w:r>
+      <w:r>
+        <w:rPr>
+          <w:b/>
+          <w:bCs/>
+          <w:color w:val="1A3C5E"/>
           <w:sz w:val="19"/>
           <w:szCs w:val="19"/>
         </w:rPr>
         <w:t xml:space="preserve"> </w:t>
       </w:r>
-      <w:r>
-        <w:rPr>
-          <w:b/>
-          <w:bCs/>
-          <w:color w:val="1A3C5E"/>
-          <w:sz w:val="19"/>
-          <w:szCs w:val="19"/>
-        </w:rPr>
-        <w:t xml:space="preserve">Autres modules développés pour des clients :</w:t>
-      </w:r>
-    </w:p>
-    <w:p>
-      <w:pPr>
-        <w:spacing w:before="20" w:after="20"/>
-        <w:ind w:left="720" w:hanging="240"/>
-      </w:pPr>
-      <w:r>
-        <w:rPr>
-          <w:color w:val="555555"/>
-          <w:sz w:val="18"/>
-          <w:szCs w:val="18"/>
-        </w:rPr>
-        <w:t xml:space="preserve">–  Suivi des chèques : état des chèques générés par les paiements de factures (reçu, encaissé, rejeté).</w:t>
-      </w:r>
-    </w:p>
-    <w:p>
-      <w:pPr>
-        <w:spacing w:before="20" w:after="20"/>
-        <w:ind w:left="720" w:hanging="240"/>
-      </w:pPr>
-      <w:r>
-        <w:rPr>
-          <w:color w:val="555555"/>
-          <w:sz w:val="18"/>
-          <w:szCs w:val="18"/>
-        </w:rPr>
-        <w:t xml:space="preserve">–  Calcul du timbre fiscal selon la méthode algérienne (activable ou non par facture d'achat / de vente).</w:t>
-      </w:r>
-    </w:p>
-    <w:p>
-      <w:pPr>
-        <w:spacing w:before="20" w:after="20"/>
-        <w:ind w:left="720" w:hanging="240"/>
-      </w:pPr>
-      <w:r>
-        <w:rPr>
-          <w:color w:val="555555"/>
-          <w:sz w:val="18"/>
-          <w:szCs w:val="18"/>
-        </w:rPr>
-        <w:t xml:space="preserve">–  Calcul des frais d'approche pour les produits importés payés en devises.</w:t>
-      </w:r>
-    </w:p>
-    <w:p>
-      <w:pPr>
-        <w:spacing w:before="20" w:after="20"/>
-        <w:ind w:left="720" w:hanging="240"/>
-      </w:pPr>
-      <w:r>
-        <w:rPr>
-          <w:color w:val="555555"/>
-          <w:sz w:val="18"/>
-          <w:szCs w:val="18"/>
-        </w:rPr>
-        <w:t xml:space="preserve">–  Authentification par numéro de téléphone avec vérification et validation SMS (utilisateurs internes et externes).</w:t>
-      </w:r>
-    </w:p>
-    <w:p>
-      <w:pPr>
-        <w:spacing w:before="20" w:after="20"/>
-        <w:ind w:left="720" w:hanging="240"/>
-      </w:pPr>
-      <w:r>
-        <w:rPr>
-          <w:color w:val="555555"/>
-          <w:sz w:val="18"/>
-          <w:szCs w:val="18"/>
-        </w:rPr>
-        <w:t xml:space="preserve">–  Distribution automatique des fiches de paie des employés selon leur matricule.</w:t>
-      </w:r>
-    </w:p>
-    <w:p>
-      <w:pPr>
-        <w:spacing w:before="20" w:after="20"/>
-        <w:ind w:left="720" w:hanging="240"/>
-      </w:pPr>
-      <w:r>
-        <w:rPr>
-          <w:color w:val="555555"/>
-          <w:sz w:val="18"/>
-          <w:szCs w:val="18"/>
-        </w:rPr>
-        <w:t xml:space="preserve">–  Plateforme web de location de véhicules : algeriacarental.com (proposition et réalisation).</w:t>
+    </w:p>
+    <w:p>
+      <w:pPr>
+        <w:spacing w:before="80" w:after="20"/>
+        <w:ind w:left="360" w:firstLine="348"/>
+      </w:pPr>
+      <w:r>
+        <w:t xml:space="preserve">. </w:t>
+      </w:r>
+      <w:r>
+        <w:t>Gestion des ressources humaines et de la paie (employés, contrats, congés, bulletins de salaire)</w:t>
+      </w:r>
+    </w:p>
+    <w:p>
+      <w:pPr>
+        <w:spacing w:before="60"/>
+        <w:ind w:firstLine="708"/>
+      </w:pPr>
+      <w:r>
+        <w:t>.</w:t>
+      </w:r>
+      <w:r>
+        <w:t xml:space="preserve"> </w:t>
+      </w:r>
+      <w:r>
+        <w:t>Gestion du parc automobile (véhicules, affectations, maintenance)</w:t>
+      </w:r>
+    </w:p>
+    <w:p>
+      <w:pPr>
+        <w:spacing w:before="60"/>
+        <w:ind w:firstLine="708"/>
+      </w:pPr>
+      <w:r>
+        <w:t xml:space="preserve">. </w:t>
+      </w:r>
+      <w:r>
+        <w:t>Vente et location d'équipements médicaux d'analyse : gestion des contrats de location, suivi de la maintenance et renouvellements</w:t>
+      </w:r>
+    </w:p>
+    <w:p>
+      <w:pPr>
+        <w:spacing w:before="60"/>
+        <w:ind w:firstLine="708"/>
+      </w:pPr>
+      <w:r>
+        <w:t xml:space="preserve">. </w:t>
+      </w:r>
+      <w:r>
+        <w:t>Gestion des stocks de médicaments importés avec traçabilité (lots, dates de péremption)</w:t>
+      </w:r>
+    </w:p>
+    <w:p>
+      <w:pPr>
+        <w:spacing w:before="60"/>
+        <w:ind w:firstLine="708"/>
+      </w:pPr>
+      <w:r>
+        <w:t xml:space="preserve">. </w:t>
+      </w:r>
+      <w:r>
+        <w:t>Vente aux clients (hôpitaux, cliniques, laboratoires), facturation et suivi des encaissements</w:t>
       </w:r>
     </w:p>
     <w:p>
@@ -2863,7 +2462,7 @@
           <w:sz w:val="19"/>
           <w:szCs w:val="19"/>
         </w:rPr>
-        <w:t xml:space="preserve">Valeurs ajoutées à MLMConseil :</w:t>
+        <w:t>Valeurs ajoutées à AASYS :</w:t>
       </w:r>
     </w:p>
     <w:p>
@@ -2877,7 +2476,7 @@
           <w:sz w:val="18"/>
           <w:szCs w:val="18"/>
         </w:rPr>
-        <w:t xml:space="preserve">–  Proposition et mise en place de normes de développement internes.</w:t>
+        <w:t>–  Tableaux de bord de suivi des projets.</w:t>
       </w:r>
     </w:p>
     <w:p>
@@ -2891,13 +2490,1079 @@
           <w:sz w:val="18"/>
           <w:szCs w:val="18"/>
         </w:rPr>
-        <w:t xml:space="preserve">–  Formation et accompagnement des nouvelles recrues.</w:t>
-      </w:r>
-    </w:p>
-    <w:p>
-      <w:pPr>
-        <w:spacing w:before="160"/>
-      </w:pPr>
+        <w:t>–  Réduction des délais de réalisation : suivi quotidien de l'avancement des tâches et déblocage des points bloquants.</w:t>
+      </w:r>
+    </w:p>
+    <w:p>
+      <w:pPr>
+        <w:spacing w:before="200" w:after="30"/>
+        <w:rPr>
+          <w:b/>
+          <w:bCs/>
+          <w:color w:val="1A3C5E"/>
+          <w:sz w:val="21"/>
+          <w:szCs w:val="21"/>
+        </w:rPr>
+      </w:pPr>
+    </w:p>
+    <w:p>
+      <w:pPr>
+        <w:spacing w:before="200" w:after="30"/>
+      </w:pPr>
+      <w:r>
+        <w:rPr>
+          <w:b/>
+          <w:bCs/>
+          <w:color w:val="1A3C5E"/>
+          <w:sz w:val="21"/>
+          <w:szCs w:val="21"/>
+        </w:rPr>
+        <w:t>Développeur Odoo</w:t>
+      </w:r>
+    </w:p>
+    <w:p>
+      <w:pPr>
+        <w:spacing w:after="60"/>
+      </w:pPr>
+      <w:proofErr w:type="spellStart"/>
+      <w:proofErr w:type="gramStart"/>
+      <w:r>
+        <w:rPr>
+          <w:i/>
+          <w:iCs/>
+          <w:color w:val="555555"/>
+          <w:sz w:val="18"/>
+          <w:szCs w:val="18"/>
+        </w:rPr>
+        <w:t>MLMConseil</w:t>
+      </w:r>
+      <w:proofErr w:type="spellEnd"/>
+      <w:r>
+        <w:rPr>
+          <w:i/>
+          <w:iCs/>
+          <w:color w:val="555555"/>
+          <w:sz w:val="18"/>
+          <w:szCs w:val="18"/>
+        </w:rPr>
+        <w:t xml:space="preserve">  •</w:t>
+      </w:r>
+      <w:proofErr w:type="gramEnd"/>
+      <w:r>
+        <w:rPr>
+          <w:i/>
+          <w:iCs/>
+          <w:color w:val="555555"/>
+          <w:sz w:val="18"/>
+          <w:szCs w:val="18"/>
+        </w:rPr>
+        <w:t xml:space="preserve">  Bouira, Algérie</w:t>
+      </w:r>
+      <w:r>
+        <w:rPr>
+          <w:b/>
+          <w:bCs/>
+          <w:color w:val="E8840A"/>
+          <w:sz w:val="18"/>
+          <w:szCs w:val="18"/>
+        </w:rPr>
+        <w:t xml:space="preserve">     juil. 2016 — mars 2019</w:t>
+      </w:r>
+    </w:p>
+    <w:p>
+      <w:pPr>
+        <w:spacing w:before="80" w:after="20"/>
+        <w:ind w:left="360"/>
+      </w:pPr>
+      <w:r>
+        <w:rPr>
+          <w:b/>
+          <w:bCs/>
+          <w:color w:val="1A3C5E"/>
+          <w:sz w:val="19"/>
+          <w:szCs w:val="19"/>
+        </w:rPr>
+        <w:t>Solution de Gestion d'Agence de Voyage</w:t>
+      </w:r>
+    </w:p>
+    <w:p>
+      <w:pPr>
+        <w:spacing w:before="20" w:after="20"/>
+        <w:ind w:left="720" w:hanging="240"/>
+      </w:pPr>
+      <w:r>
+        <w:rPr>
+          <w:color w:val="555555"/>
+          <w:sz w:val="18"/>
+          <w:szCs w:val="18"/>
+        </w:rPr>
+        <w:t>–  Solution ERP complète pour agences de voyages :</w:t>
+      </w:r>
+    </w:p>
+    <w:p>
+      <w:pPr>
+        <w:spacing w:before="20" w:after="20"/>
+        <w:ind w:left="960" w:hanging="240"/>
+      </w:pPr>
+      <w:r>
+        <w:rPr>
+          <w:color w:val="555555"/>
+          <w:sz w:val="18"/>
+          <w:szCs w:val="18"/>
+        </w:rPr>
+        <w:t>· Gestion</w:t>
+      </w:r>
+      <w:r>
+        <w:rPr>
+          <w:color w:val="555555"/>
+          <w:sz w:val="18"/>
+          <w:szCs w:val="18"/>
+        </w:rPr>
+        <w:t xml:space="preserve"> des fournisseurs (hôtels, transporteurs, guides) et des circuits / voyages organisés</w:t>
+      </w:r>
+    </w:p>
+    <w:p>
+      <w:pPr>
+        <w:spacing w:before="20" w:after="20"/>
+        <w:ind w:left="960" w:hanging="240"/>
+      </w:pPr>
+      <w:r>
+        <w:rPr>
+          <w:color w:val="555555"/>
+          <w:sz w:val="18"/>
+          <w:szCs w:val="18"/>
+        </w:rPr>
+        <w:t>· Gestion</w:t>
+      </w:r>
+      <w:r>
+        <w:rPr>
+          <w:color w:val="555555"/>
+          <w:sz w:val="18"/>
+          <w:szCs w:val="18"/>
+        </w:rPr>
+        <w:t xml:space="preserve"> des réservations, devis et contrats clients avec suivi des paiements et acomptes</w:t>
+      </w:r>
+    </w:p>
+    <w:p>
+      <w:pPr>
+        <w:spacing w:before="20" w:after="20"/>
+        <w:ind w:left="960" w:hanging="240"/>
+      </w:pPr>
+      <w:r>
+        <w:rPr>
+          <w:color w:val="555555"/>
+          <w:sz w:val="18"/>
+          <w:szCs w:val="18"/>
+        </w:rPr>
+        <w:lastRenderedPageBreak/>
+        <w:t>· Intégration</w:t>
+      </w:r>
+      <w:r>
+        <w:rPr>
+          <w:color w:val="555555"/>
+          <w:sz w:val="18"/>
+          <w:szCs w:val="18"/>
+        </w:rPr>
+        <w:t xml:space="preserve"> email </w:t>
+      </w:r>
+      <w:proofErr w:type="spellStart"/>
+      <w:r>
+        <w:rPr>
+          <w:color w:val="555555"/>
+          <w:sz w:val="18"/>
+          <w:szCs w:val="18"/>
+        </w:rPr>
+        <w:t>Bedsonline</w:t>
+      </w:r>
+      <w:proofErr w:type="spellEnd"/>
+      <w:r>
+        <w:rPr>
+          <w:color w:val="555555"/>
+          <w:sz w:val="18"/>
+          <w:szCs w:val="18"/>
+        </w:rPr>
+        <w:t xml:space="preserve"> : réception et traitement automatique des confirmations de réservation d'hôtel dans Odoo</w:t>
+      </w:r>
+    </w:p>
+    <w:p>
+      <w:pPr>
+        <w:spacing w:before="20" w:after="20"/>
+        <w:ind w:left="960" w:hanging="240"/>
+      </w:pPr>
+      <w:proofErr w:type="gramStart"/>
+      <w:r>
+        <w:rPr>
+          <w:color w:val="555555"/>
+          <w:sz w:val="18"/>
+          <w:szCs w:val="18"/>
+        </w:rPr>
+        <w:t xml:space="preserve">·  </w:t>
+      </w:r>
+      <w:proofErr w:type="spellStart"/>
+      <w:r>
+        <w:rPr>
+          <w:color w:val="555555"/>
+          <w:sz w:val="18"/>
+          <w:szCs w:val="18"/>
+        </w:rPr>
+        <w:t>Parsing</w:t>
+      </w:r>
+      <w:proofErr w:type="spellEnd"/>
+      <w:proofErr w:type="gramEnd"/>
+      <w:r>
+        <w:rPr>
+          <w:color w:val="555555"/>
+          <w:sz w:val="18"/>
+          <w:szCs w:val="18"/>
+        </w:rPr>
+        <w:t xml:space="preserve"> des fichiers Amadeus : import et création automatique de devis et réservations de vols dans Odoo</w:t>
+      </w:r>
+    </w:p>
+    <w:p>
+      <w:pPr>
+        <w:spacing w:before="20" w:after="20"/>
+        <w:ind w:left="960" w:hanging="240"/>
+      </w:pPr>
+      <w:proofErr w:type="gramStart"/>
+      <w:r>
+        <w:rPr>
+          <w:color w:val="555555"/>
+          <w:sz w:val="18"/>
+          <w:szCs w:val="18"/>
+        </w:rPr>
+        <w:t>·  Facturation</w:t>
+      </w:r>
+      <w:proofErr w:type="gramEnd"/>
+      <w:r>
+        <w:rPr>
+          <w:color w:val="555555"/>
+          <w:sz w:val="18"/>
+          <w:szCs w:val="18"/>
+        </w:rPr>
+        <w:t xml:space="preserve"> clients et gestion de la trésorerie agence</w:t>
+      </w:r>
+    </w:p>
+    <w:p>
+      <w:pPr>
+        <w:spacing w:before="80" w:after="20"/>
+        <w:ind w:left="360"/>
+      </w:pPr>
+      <w:r>
+        <w:rPr>
+          <w:rFonts w:ascii="Cambria Math" w:hAnsi="Cambria Math" w:cs="Cambria Math"/>
+          <w:b/>
+          <w:bCs/>
+          <w:color w:val="E8840A"/>
+          <w:sz w:val="19"/>
+          <w:szCs w:val="19"/>
+        </w:rPr>
+        <w:t>◆</w:t>
+      </w:r>
+      <w:r>
+        <w:rPr>
+          <w:b/>
+          <w:bCs/>
+          <w:color w:val="E8840A"/>
+          <w:sz w:val="19"/>
+          <w:szCs w:val="19"/>
+        </w:rPr>
+        <w:t xml:space="preserve"> </w:t>
+      </w:r>
+      <w:r>
+        <w:rPr>
+          <w:b/>
+          <w:bCs/>
+          <w:color w:val="1A3C5E"/>
+          <w:sz w:val="19"/>
+          <w:szCs w:val="19"/>
+        </w:rPr>
+        <w:t>Solution de Gestion de Location de Voiture</w:t>
+      </w:r>
+    </w:p>
+    <w:p>
+      <w:pPr>
+        <w:spacing w:before="20" w:after="20"/>
+        <w:ind w:left="720" w:hanging="240"/>
+      </w:pPr>
+      <w:r>
+        <w:rPr>
+          <w:color w:val="555555"/>
+          <w:sz w:val="18"/>
+          <w:szCs w:val="18"/>
+        </w:rPr>
+        <w:t>–  Solution complète de gestion de flotte et de location :</w:t>
+      </w:r>
+    </w:p>
+    <w:p>
+      <w:pPr>
+        <w:spacing w:before="20" w:after="20"/>
+        <w:ind w:left="960" w:hanging="240"/>
+      </w:pPr>
+      <w:proofErr w:type="gramStart"/>
+      <w:r>
+        <w:rPr>
+          <w:color w:val="555555"/>
+          <w:sz w:val="18"/>
+          <w:szCs w:val="18"/>
+        </w:rPr>
+        <w:t>·  Gestion</w:t>
+      </w:r>
+      <w:proofErr w:type="gramEnd"/>
+      <w:r>
+        <w:rPr>
+          <w:color w:val="555555"/>
+          <w:sz w:val="18"/>
+          <w:szCs w:val="18"/>
+        </w:rPr>
+        <w:t xml:space="preserve"> du parc de véhicules : fiches techniques, disponibilité, kilométrage et maintenance</w:t>
+      </w:r>
+    </w:p>
+    <w:p>
+      <w:pPr>
+        <w:spacing w:before="20" w:after="20"/>
+        <w:ind w:left="960" w:hanging="240"/>
+      </w:pPr>
+      <w:proofErr w:type="gramStart"/>
+      <w:r>
+        <w:rPr>
+          <w:color w:val="555555"/>
+          <w:sz w:val="18"/>
+          <w:szCs w:val="18"/>
+        </w:rPr>
+        <w:t>·  Contrats</w:t>
+      </w:r>
+      <w:proofErr w:type="gramEnd"/>
+      <w:r>
+        <w:rPr>
+          <w:color w:val="555555"/>
+          <w:sz w:val="18"/>
+          <w:szCs w:val="18"/>
+        </w:rPr>
+        <w:t xml:space="preserve"> de location : réservation, remise/restitution du véhicule, état des lieux</w:t>
+      </w:r>
+    </w:p>
+    <w:p>
+      <w:pPr>
+        <w:spacing w:before="20" w:after="20"/>
+        <w:ind w:left="960" w:hanging="240"/>
+      </w:pPr>
+      <w:proofErr w:type="gramStart"/>
+      <w:r>
+        <w:rPr>
+          <w:color w:val="555555"/>
+          <w:sz w:val="18"/>
+          <w:szCs w:val="18"/>
+        </w:rPr>
+        <w:t>·  Gestion</w:t>
+      </w:r>
+      <w:proofErr w:type="gramEnd"/>
+      <w:r>
+        <w:rPr>
+          <w:color w:val="555555"/>
+          <w:sz w:val="18"/>
+          <w:szCs w:val="18"/>
+        </w:rPr>
+        <w:t xml:space="preserve"> des cautions, amendes et sinistres</w:t>
+      </w:r>
+    </w:p>
+    <w:p>
+      <w:pPr>
+        <w:spacing w:before="20" w:after="20"/>
+        <w:ind w:left="960" w:hanging="240"/>
+        <w:rPr>
+          <w:color w:val="555555"/>
+          <w:sz w:val="18"/>
+          <w:szCs w:val="18"/>
+        </w:rPr>
+      </w:pPr>
+      <w:proofErr w:type="gramStart"/>
+      <w:r>
+        <w:rPr>
+          <w:color w:val="555555"/>
+          <w:sz w:val="18"/>
+          <w:szCs w:val="18"/>
+        </w:rPr>
+        <w:t>·  Facturation</w:t>
+      </w:r>
+      <w:proofErr w:type="gramEnd"/>
+      <w:r>
+        <w:rPr>
+          <w:color w:val="555555"/>
+          <w:sz w:val="18"/>
+          <w:szCs w:val="18"/>
+        </w:rPr>
+        <w:t xml:space="preserve"> clients et suivi des paiements</w:t>
+      </w:r>
+    </w:p>
+    <w:p>
+      <w:pPr>
+        <w:spacing w:before="20" w:after="20"/>
+        <w:ind w:left="960" w:hanging="240"/>
+      </w:pPr>
+    </w:p>
+    <w:p>
+      <w:pPr>
+        <w:spacing w:before="80" w:after="20"/>
+        <w:ind w:left="360"/>
+      </w:pPr>
+      <w:r>
+        <w:rPr>
+          <w:rFonts w:ascii="Cambria Math" w:hAnsi="Cambria Math" w:cs="Cambria Math"/>
+          <w:b/>
+          <w:bCs/>
+          <w:color w:val="E8840A"/>
+          <w:sz w:val="19"/>
+          <w:szCs w:val="19"/>
+        </w:rPr>
+        <w:t>◆</w:t>
+      </w:r>
+      <w:r>
+        <w:rPr>
+          <w:b/>
+          <w:bCs/>
+          <w:color w:val="E8840A"/>
+          <w:sz w:val="19"/>
+          <w:szCs w:val="19"/>
+        </w:rPr>
+        <w:t xml:space="preserve"> </w:t>
+      </w:r>
+      <w:r>
+        <w:rPr>
+          <w:b/>
+          <w:bCs/>
+          <w:color w:val="1A3C5E"/>
+          <w:sz w:val="19"/>
+          <w:szCs w:val="19"/>
+        </w:rPr>
+        <w:t>Solution Import / Export</w:t>
+      </w:r>
+    </w:p>
+    <w:p>
+      <w:pPr>
+        <w:spacing w:before="20" w:after="20"/>
+        <w:ind w:left="720" w:hanging="240"/>
+      </w:pPr>
+      <w:r>
+        <w:rPr>
+          <w:color w:val="555555"/>
+          <w:sz w:val="18"/>
+          <w:szCs w:val="18"/>
+        </w:rPr>
+        <w:t>–  Solution ERP dédiée aux opérations de commerce international :</w:t>
+      </w:r>
+    </w:p>
+    <w:p>
+      <w:pPr>
+        <w:spacing w:before="20" w:after="20"/>
+        <w:ind w:left="960" w:hanging="240"/>
+      </w:pPr>
+      <w:proofErr w:type="gramStart"/>
+      <w:r>
+        <w:rPr>
+          <w:color w:val="555555"/>
+          <w:sz w:val="18"/>
+          <w:szCs w:val="18"/>
+        </w:rPr>
+        <w:t>·  Gestion</w:t>
+      </w:r>
+      <w:proofErr w:type="gramEnd"/>
+      <w:r>
+        <w:rPr>
+          <w:color w:val="555555"/>
+          <w:sz w:val="18"/>
+          <w:szCs w:val="18"/>
+        </w:rPr>
+        <w:t xml:space="preserve"> des </w:t>
+      </w:r>
+      <w:proofErr w:type="spellStart"/>
+      <w:r>
+        <w:rPr>
+          <w:color w:val="555555"/>
+          <w:sz w:val="18"/>
+          <w:szCs w:val="18"/>
+        </w:rPr>
+        <w:t>manifests</w:t>
+      </w:r>
+      <w:proofErr w:type="spellEnd"/>
+      <w:r>
+        <w:rPr>
+          <w:color w:val="555555"/>
+          <w:sz w:val="18"/>
+          <w:szCs w:val="18"/>
+        </w:rPr>
+        <w:t xml:space="preserve"> de chargement et des connaissements (bill of </w:t>
+      </w:r>
+      <w:proofErr w:type="spellStart"/>
+      <w:r>
+        <w:rPr>
+          <w:color w:val="555555"/>
+          <w:sz w:val="18"/>
+          <w:szCs w:val="18"/>
+        </w:rPr>
+        <w:t>lading</w:t>
+      </w:r>
+      <w:proofErr w:type="spellEnd"/>
+      <w:r>
+        <w:rPr>
+          <w:color w:val="555555"/>
+          <w:sz w:val="18"/>
+          <w:szCs w:val="18"/>
+        </w:rPr>
+        <w:t>)</w:t>
+      </w:r>
+    </w:p>
+    <w:p>
+      <w:pPr>
+        <w:spacing w:before="20" w:after="20"/>
+        <w:ind w:left="960" w:hanging="240"/>
+      </w:pPr>
+      <w:proofErr w:type="gramStart"/>
+      <w:r>
+        <w:rPr>
+          <w:color w:val="555555"/>
+          <w:sz w:val="18"/>
+          <w:szCs w:val="18"/>
+        </w:rPr>
+        <w:t>·  Suivi</w:t>
+      </w:r>
+      <w:proofErr w:type="gramEnd"/>
+      <w:r>
+        <w:rPr>
+          <w:color w:val="555555"/>
+          <w:sz w:val="18"/>
+          <w:szCs w:val="18"/>
+        </w:rPr>
+        <w:t xml:space="preserve"> des expéditions et gestion des transitaires</w:t>
+      </w:r>
+    </w:p>
+    <w:p>
+      <w:pPr>
+        <w:spacing w:before="20" w:after="20"/>
+        <w:ind w:left="960" w:hanging="240"/>
+      </w:pPr>
+      <w:proofErr w:type="gramStart"/>
+      <w:r>
+        <w:rPr>
+          <w:color w:val="555555"/>
+          <w:sz w:val="18"/>
+          <w:szCs w:val="18"/>
+        </w:rPr>
+        <w:t>·  Gestion</w:t>
+      </w:r>
+      <w:proofErr w:type="gramEnd"/>
+      <w:r>
+        <w:rPr>
+          <w:color w:val="555555"/>
+          <w:sz w:val="18"/>
+          <w:szCs w:val="18"/>
+        </w:rPr>
+        <w:t xml:space="preserve"> des formalités douanières et documents réglementaires</w:t>
+      </w:r>
+    </w:p>
+    <w:p>
+      <w:pPr>
+        <w:spacing w:before="20" w:after="20"/>
+        <w:ind w:left="960" w:hanging="240"/>
+      </w:pPr>
+      <w:proofErr w:type="gramStart"/>
+      <w:r>
+        <w:rPr>
+          <w:color w:val="555555"/>
+          <w:sz w:val="18"/>
+          <w:szCs w:val="18"/>
+        </w:rPr>
+        <w:t>·  Facturation</w:t>
+      </w:r>
+      <w:proofErr w:type="gramEnd"/>
+      <w:r>
+        <w:rPr>
+          <w:color w:val="555555"/>
+          <w:sz w:val="18"/>
+          <w:szCs w:val="18"/>
+        </w:rPr>
+        <w:t xml:space="preserve"> en devises et gestion des écarts de change</w:t>
+      </w:r>
+    </w:p>
+    <w:p>
+      <w:pPr>
+        <w:spacing w:before="80" w:after="20"/>
+        <w:ind w:left="360"/>
+      </w:pPr>
+      <w:r>
+        <w:rPr>
+          <w:rFonts w:ascii="Cambria Math" w:hAnsi="Cambria Math" w:cs="Cambria Math"/>
+          <w:b/>
+          <w:bCs/>
+          <w:color w:val="E8840A"/>
+          <w:sz w:val="19"/>
+          <w:szCs w:val="19"/>
+        </w:rPr>
+        <w:t>◆</w:t>
+      </w:r>
+      <w:r>
+        <w:rPr>
+          <w:b/>
+          <w:bCs/>
+          <w:color w:val="E8840A"/>
+          <w:sz w:val="19"/>
+          <w:szCs w:val="19"/>
+        </w:rPr>
+        <w:t xml:space="preserve"> </w:t>
+      </w:r>
+      <w:r>
+        <w:rPr>
+          <w:b/>
+          <w:bCs/>
+          <w:color w:val="1A3C5E"/>
+          <w:sz w:val="19"/>
+          <w:szCs w:val="19"/>
+        </w:rPr>
+        <w:t>Solution de Gestion d'École Privée</w:t>
+      </w:r>
+    </w:p>
+    <w:p>
+      <w:pPr>
+        <w:spacing w:before="20" w:after="20"/>
+        <w:ind w:left="720" w:hanging="240"/>
+      </w:pPr>
+      <w:r>
+        <w:rPr>
+          <w:color w:val="555555"/>
+          <w:sz w:val="18"/>
+          <w:szCs w:val="18"/>
+        </w:rPr>
+        <w:t>–  Solution de gestion scolaire complète :</w:t>
+      </w:r>
+    </w:p>
+    <w:p>
+      <w:pPr>
+        <w:spacing w:before="20" w:after="20"/>
+        <w:ind w:left="960" w:hanging="240"/>
+      </w:pPr>
+      <w:proofErr w:type="gramStart"/>
+      <w:r>
+        <w:rPr>
+          <w:color w:val="555555"/>
+          <w:sz w:val="18"/>
+          <w:szCs w:val="18"/>
+        </w:rPr>
+        <w:t>·  Gestion</w:t>
+      </w:r>
+      <w:proofErr w:type="gramEnd"/>
+      <w:r>
+        <w:rPr>
+          <w:color w:val="555555"/>
+          <w:sz w:val="18"/>
+          <w:szCs w:val="18"/>
+        </w:rPr>
+        <w:t xml:space="preserve"> des inscriptions, dossiers élèves et profils enseignants</w:t>
+      </w:r>
+    </w:p>
+    <w:p>
+      <w:pPr>
+        <w:spacing w:before="20" w:after="20"/>
+        <w:ind w:left="960" w:hanging="240"/>
+      </w:pPr>
+      <w:proofErr w:type="gramStart"/>
+      <w:r>
+        <w:rPr>
+          <w:color w:val="555555"/>
+          <w:sz w:val="18"/>
+          <w:szCs w:val="18"/>
+        </w:rPr>
+        <w:t>·  Planification</w:t>
+      </w:r>
+      <w:proofErr w:type="gramEnd"/>
+      <w:r>
+        <w:rPr>
+          <w:color w:val="555555"/>
+          <w:sz w:val="18"/>
+          <w:szCs w:val="18"/>
+        </w:rPr>
+        <w:t xml:space="preserve"> des emplois du temps et affectation des classes</w:t>
+      </w:r>
+    </w:p>
+    <w:p>
+      <w:pPr>
+        <w:spacing w:before="20" w:after="20"/>
+        <w:ind w:left="960" w:hanging="240"/>
+      </w:pPr>
+      <w:proofErr w:type="gramStart"/>
+      <w:r>
+        <w:rPr>
+          <w:color w:val="555555"/>
+          <w:sz w:val="18"/>
+          <w:szCs w:val="18"/>
+        </w:rPr>
+        <w:t>·  Suivi</w:t>
+      </w:r>
+      <w:proofErr w:type="gramEnd"/>
+      <w:r>
+        <w:rPr>
+          <w:color w:val="555555"/>
+          <w:sz w:val="18"/>
+          <w:szCs w:val="18"/>
+        </w:rPr>
+        <w:t xml:space="preserve"> des présences et gestion des absences</w:t>
+      </w:r>
+    </w:p>
+    <w:p>
+      <w:pPr>
+        <w:spacing w:before="20" w:after="20"/>
+        <w:ind w:left="960" w:hanging="240"/>
+      </w:pPr>
+      <w:proofErr w:type="gramStart"/>
+      <w:r>
+        <w:rPr>
+          <w:color w:val="555555"/>
+          <w:sz w:val="18"/>
+          <w:szCs w:val="18"/>
+        </w:rPr>
+        <w:t>·  Gestion</w:t>
+      </w:r>
+      <w:proofErr w:type="gramEnd"/>
+      <w:r>
+        <w:rPr>
+          <w:color w:val="555555"/>
+          <w:sz w:val="18"/>
+          <w:szCs w:val="18"/>
+        </w:rPr>
+        <w:t xml:space="preserve"> des examens, notation et édition des bulletins de notes</w:t>
+      </w:r>
+    </w:p>
+    <w:p>
+      <w:pPr>
+        <w:spacing w:before="20" w:after="20"/>
+        <w:ind w:left="960" w:hanging="240"/>
+      </w:pPr>
+      <w:proofErr w:type="gramStart"/>
+      <w:r>
+        <w:rPr>
+          <w:color w:val="555555"/>
+          <w:sz w:val="18"/>
+          <w:szCs w:val="18"/>
+        </w:rPr>
+        <w:t>·  Facturation</w:t>
+      </w:r>
+      <w:proofErr w:type="gramEnd"/>
+      <w:r>
+        <w:rPr>
+          <w:color w:val="555555"/>
+          <w:sz w:val="18"/>
+          <w:szCs w:val="18"/>
+        </w:rPr>
+        <w:t xml:space="preserve"> des frais de scolarité et suivi des paiements</w:t>
+      </w:r>
+    </w:p>
+    <w:p>
+      <w:pPr>
+        <w:spacing w:before="80" w:after="20"/>
+        <w:ind w:left="360"/>
+      </w:pPr>
+      <w:r>
+        <w:rPr>
+          <w:rFonts w:ascii="Cambria Math" w:hAnsi="Cambria Math" w:cs="Cambria Math"/>
+          <w:b/>
+          <w:bCs/>
+          <w:color w:val="E8840A"/>
+          <w:sz w:val="19"/>
+          <w:szCs w:val="19"/>
+        </w:rPr>
+        <w:t>◆</w:t>
+      </w:r>
+      <w:r>
+        <w:rPr>
+          <w:b/>
+          <w:bCs/>
+          <w:color w:val="E8840A"/>
+          <w:sz w:val="19"/>
+          <w:szCs w:val="19"/>
+        </w:rPr>
+        <w:t xml:space="preserve"> </w:t>
+      </w:r>
+      <w:r>
+        <w:rPr>
+          <w:b/>
+          <w:bCs/>
+          <w:color w:val="1A3C5E"/>
+          <w:sz w:val="19"/>
+          <w:szCs w:val="19"/>
+        </w:rPr>
+        <w:t>Personnalisation de modules Odoo standard</w:t>
+      </w:r>
+    </w:p>
+    <w:p>
+      <w:pPr>
+        <w:spacing w:before="20" w:after="20"/>
+        <w:ind w:left="720" w:hanging="240"/>
+      </w:pPr>
+      <w:r>
+        <w:rPr>
+          <w:color w:val="555555"/>
+          <w:sz w:val="18"/>
+          <w:szCs w:val="18"/>
+        </w:rPr>
+        <w:t>–  CRM, Vente, Achat, Stock, Facturation, Comptabilité, RH &amp; Paie</w:t>
+      </w:r>
+    </w:p>
+    <w:p>
+      <w:pPr>
+        <w:spacing w:before="80" w:after="20"/>
+        <w:ind w:left="360"/>
+      </w:pPr>
+      <w:r>
+        <w:rPr>
+          <w:rFonts w:ascii="Cambria Math" w:hAnsi="Cambria Math" w:cs="Cambria Math"/>
+          <w:b/>
+          <w:bCs/>
+          <w:color w:val="E8840A"/>
+          <w:sz w:val="19"/>
+          <w:szCs w:val="19"/>
+        </w:rPr>
+        <w:t>◆</w:t>
+      </w:r>
+      <w:r>
+        <w:rPr>
+          <w:b/>
+          <w:bCs/>
+          <w:color w:val="E8840A"/>
+          <w:sz w:val="19"/>
+          <w:szCs w:val="19"/>
+        </w:rPr>
+        <w:t xml:space="preserve"> </w:t>
+      </w:r>
+      <w:r>
+        <w:rPr>
+          <w:b/>
+          <w:bCs/>
+          <w:color w:val="1A3C5E"/>
+          <w:sz w:val="19"/>
+          <w:szCs w:val="19"/>
+        </w:rPr>
+        <w:t>APIs pour applications tierces</w:t>
+      </w:r>
+    </w:p>
+    <w:p>
+      <w:pPr>
+        <w:spacing w:before="20" w:after="20"/>
+        <w:ind w:left="720" w:hanging="240"/>
+      </w:pPr>
+      <w:r>
+        <w:rPr>
+          <w:color w:val="555555"/>
+          <w:sz w:val="18"/>
+          <w:szCs w:val="18"/>
+        </w:rPr>
+        <w:t>–  Accès et synchronisation des données Odoo via APIs REST</w:t>
+      </w:r>
+    </w:p>
+    <w:p>
+      <w:pPr>
+        <w:spacing w:before="80" w:after="20"/>
+        <w:ind w:left="360"/>
+      </w:pPr>
+      <w:r>
+        <w:rPr>
+          <w:rFonts w:ascii="Cambria Math" w:hAnsi="Cambria Math" w:cs="Cambria Math"/>
+          <w:b/>
+          <w:bCs/>
+          <w:color w:val="E8840A"/>
+          <w:sz w:val="19"/>
+          <w:szCs w:val="19"/>
+        </w:rPr>
+        <w:t>◆</w:t>
+      </w:r>
+      <w:r>
+        <w:rPr>
+          <w:b/>
+          <w:bCs/>
+          <w:color w:val="E8840A"/>
+          <w:sz w:val="19"/>
+          <w:szCs w:val="19"/>
+        </w:rPr>
+        <w:t xml:space="preserve"> </w:t>
+      </w:r>
+      <w:r>
+        <w:rPr>
+          <w:b/>
+          <w:bCs/>
+          <w:color w:val="1A3C5E"/>
+          <w:sz w:val="19"/>
+          <w:szCs w:val="19"/>
+        </w:rPr>
+        <w:t>Autres modules développés pour des clients :</w:t>
+      </w:r>
+    </w:p>
+    <w:p>
+      <w:pPr>
+        <w:spacing w:before="20" w:after="20"/>
+        <w:ind w:left="720" w:hanging="240"/>
+      </w:pPr>
+      <w:r>
+        <w:rPr>
+          <w:color w:val="555555"/>
+          <w:sz w:val="18"/>
+          <w:szCs w:val="18"/>
+        </w:rPr>
+        <w:t>–  Suivi des chèques : état des chèques générés par les paiements de factures (reçu, encaissé, rejeté).</w:t>
+      </w:r>
+    </w:p>
+    <w:p>
+      <w:pPr>
+        <w:spacing w:before="20" w:after="20"/>
+        <w:ind w:left="720" w:hanging="240"/>
+      </w:pPr>
+      <w:r>
+        <w:rPr>
+          <w:color w:val="555555"/>
+          <w:sz w:val="18"/>
+          <w:szCs w:val="18"/>
+        </w:rPr>
+        <w:t>–  Calcul du timbre fiscal selon la méthode algérienne (activable ou non par facture d'achat / de vente).</w:t>
+      </w:r>
+    </w:p>
+    <w:p>
+      <w:pPr>
+        <w:spacing w:before="20" w:after="20"/>
+        <w:ind w:left="720" w:hanging="240"/>
+      </w:pPr>
+      <w:r>
+        <w:rPr>
+          <w:color w:val="555555"/>
+          <w:sz w:val="18"/>
+          <w:szCs w:val="18"/>
+        </w:rPr>
+        <w:t>–  Calcul des frais d'approche pour les produits importés payés en devises.</w:t>
+      </w:r>
+    </w:p>
+    <w:p>
+      <w:pPr>
+        <w:spacing w:before="20" w:after="20"/>
+        <w:ind w:left="720" w:hanging="240"/>
+      </w:pPr>
+      <w:r>
+        <w:rPr>
+          <w:color w:val="555555"/>
+          <w:sz w:val="18"/>
+          <w:szCs w:val="18"/>
+        </w:rPr>
+        <w:t>–  Authentification par numéro de téléphone avec vérification et validation SMS (utilisateurs internes et externes).</w:t>
+      </w:r>
+    </w:p>
+    <w:p>
+      <w:pPr>
+        <w:spacing w:before="20" w:after="20"/>
+        <w:ind w:left="720" w:hanging="240"/>
+      </w:pPr>
+      <w:r>
+        <w:rPr>
+          <w:color w:val="555555"/>
+          <w:sz w:val="18"/>
+          <w:szCs w:val="18"/>
+        </w:rPr>
+        <w:t>–  Distribution automatique des fiches de paie des employés selon leur matricule.</w:t>
+      </w:r>
+    </w:p>
+    <w:p>
+      <w:pPr>
+        <w:spacing w:before="20" w:after="20"/>
+        <w:ind w:left="720" w:hanging="240"/>
+      </w:pPr>
+      <w:r>
+        <w:rPr>
+          <w:color w:val="555555"/>
+          <w:sz w:val="18"/>
+          <w:szCs w:val="18"/>
+        </w:rPr>
+        <w:t>–  Plateforme web de location de véhicules : algeriacarental.com (proposition et réalisation).</w:t>
+      </w:r>
+    </w:p>
+    <w:p>
+      <w:pPr>
+        <w:spacing w:before="80" w:after="20"/>
+        <w:ind w:left="360"/>
+      </w:pPr>
+      <w:r>
+        <w:rPr>
+          <w:rFonts w:ascii="Cambria Math" w:hAnsi="Cambria Math" w:cs="Cambria Math"/>
+          <w:b/>
+          <w:bCs/>
+          <w:color w:val="E8840A"/>
+          <w:sz w:val="19"/>
+          <w:szCs w:val="19"/>
+        </w:rPr>
+        <w:t>◆</w:t>
+      </w:r>
+      <w:r>
+        <w:rPr>
+          <w:b/>
+          <w:bCs/>
+          <w:color w:val="E8840A"/>
+          <w:sz w:val="19"/>
+          <w:szCs w:val="19"/>
+        </w:rPr>
+        <w:t xml:space="preserve"> </w:t>
+      </w:r>
+      <w:r>
+        <w:rPr>
+          <w:b/>
+          <w:bCs/>
+          <w:color w:val="1A3C5E"/>
+          <w:sz w:val="19"/>
+          <w:szCs w:val="19"/>
+        </w:rPr>
+        <w:t xml:space="preserve">Valeurs ajoutées à </w:t>
+      </w:r>
+      <w:proofErr w:type="spellStart"/>
+      <w:r>
+        <w:rPr>
+          <w:b/>
+          <w:bCs/>
+          <w:color w:val="1A3C5E"/>
+          <w:sz w:val="19"/>
+          <w:szCs w:val="19"/>
+        </w:rPr>
+        <w:t>MLMConseil</w:t>
+      </w:r>
+      <w:proofErr w:type="spellEnd"/>
+      <w:r>
+        <w:rPr>
+          <w:b/>
+          <w:bCs/>
+          <w:color w:val="1A3C5E"/>
+          <w:sz w:val="19"/>
+          <w:szCs w:val="19"/>
+        </w:rPr>
+        <w:t xml:space="preserve"> :</w:t>
+      </w:r>
+    </w:p>
+    <w:p>
+      <w:pPr>
+        <w:spacing w:before="20" w:after="20"/>
+        <w:ind w:left="720" w:hanging="240"/>
+      </w:pPr>
+      <w:r>
+        <w:rPr>
+          <w:color w:val="555555"/>
+          <w:sz w:val="18"/>
+          <w:szCs w:val="18"/>
+        </w:rPr>
+        <w:t>–  Proposition et mise en place de normes de développement internes.</w:t>
+      </w:r>
+    </w:p>
+    <w:p>
+      <w:pPr>
+        <w:spacing w:before="20" w:after="20"/>
+        <w:ind w:left="720" w:hanging="240"/>
+      </w:pPr>
+      <w:r>
+        <w:rPr>
+          <w:color w:val="555555"/>
+          <w:sz w:val="18"/>
+          <w:szCs w:val="18"/>
+        </w:rPr>
+        <w:t>–  Formation et accompagnement des nouvelles recrues.</w:t>
+      </w:r>
     </w:p>
     <w:p>
       <w:pPr>
@@ -2908,8 +3573,6 @@
           <w:right w:val="none" w:sz="0" w:space="0" w:color="FFFFFF"/>
         </w:pBdr>
         <w:spacing w:before="240" w:after="80"/>
-      </w:pPr>
-      <w:r>
         <w:rPr>
           <w:b/>
           <w:bCs/>
@@ -2918,6 +3581,27 @@
           <w:sz w:val="22"/>
           <w:szCs w:val="22"/>
         </w:rPr>
+      </w:pPr>
+    </w:p>
+    <w:p>
+      <w:pPr>
+        <w:pBdr>
+          <w:top w:val="none" w:sz="0" w:space="0" w:color="FFFFFF"/>
+          <w:left w:val="none" w:sz="0" w:space="0" w:color="FFFFFF"/>
+          <w:bottom w:val="single" w:sz="8" w:space="0" w:color="2E6EA6"/>
+          <w:right w:val="none" w:sz="0" w:space="0" w:color="FFFFFF"/>
+        </w:pBdr>
+        <w:spacing w:before="240" w:after="80"/>
+      </w:pPr>
+      <w:r>
+        <w:rPr>
+          <w:b/>
+          <w:bCs/>
+          <w:color w:val="1A3C5E"/>
+          <w:spacing w:val="40"/>
+          <w:sz w:val="22"/>
+          <w:szCs w:val="22"/>
+        </w:rPr>
         <w:t>FORMATION</w:t>
       </w:r>
     </w:p>
@@ -3015,6 +3699,11 @@
       <w:pPr>
         <w:spacing w:before="20" w:after="20"/>
         <w:ind w:left="720" w:hanging="240"/>
+        <w:rPr>
+          <w:color w:val="555555"/>
+          <w:sz w:val="18"/>
+          <w:szCs w:val="18"/>
+        </w:rPr>
       </w:pPr>
       <w:r>
         <w:rPr>
@@ -3026,45 +3715,66 @@
       </w:r>
     </w:p>
     <w:p>
-      <w:r>
-        <w:rPr>
-          <w:color w:val="C8DCF0"/>
+      <w:pPr>
+        <w:spacing w:before="20" w:after="20"/>
+        <w:ind w:left="720" w:hanging="240"/>
+      </w:pPr>
+    </w:p>
+    <w:p>
+      <w:pPr>
+        <w:rPr>
+          <w:color w:val="auto"/>
+        </w:rPr>
+      </w:pPr>
+      <w:r>
+        <w:rPr>
+          <w:color w:val="auto"/>
           <w:sz w:val="19"/>
           <w:szCs w:val="19"/>
         </w:rPr>
         <w:t xml:space="preserve">LinkedIn : </w:t>
       </w:r>
-      <w:hyperlink r:id="rId8">
+      <w:hyperlink r:id="rId6">
         <w:r>
           <w:rPr>
-            <w:color w:val="C8DCF0"/>
+            <w:color w:val="auto"/>
             <w:sz w:val="19"/>
             <w:szCs w:val="19"/>
           </w:rPr>
-          <w:t xml:space="preserve">linkedin.com/in/farid-slimani</w:t>
+          <w:t>linkedin.com/in/</w:t>
         </w:r>
-      </w:hyperlink>
-      <w:r>
-        <w:rPr>
-          <w:color w:val="C8DCF0"/>
-          <w:sz w:val="19"/>
-          <w:szCs w:val="19"/>
-        </w:rPr>
-        <w:t xml:space="preserve">  |  Odoo Apps : </w:t>
-      </w:r>
-      <w:hyperlink r:id="rId9">
+        <w:proofErr w:type="spellStart"/>
         <w:r>
           <w:rPr>
-            <w:color w:val="C8DCF0"/>
+            <w:color w:val="auto"/>
             <w:sz w:val="19"/>
             <w:szCs w:val="19"/>
           </w:rPr>
-          <w:t xml:space="preserve">apps.odoo.com</w:t>
+          <w:t>farid-slimani</w:t>
+        </w:r>
+        <w:proofErr w:type="spellEnd"/>
+      </w:hyperlink>
+      <w:r>
+        <w:rPr>
+          <w:color w:val="auto"/>
+          <w:sz w:val="19"/>
+          <w:szCs w:val="19"/>
+        </w:rPr>
+        <w:t xml:space="preserve">  |  Odoo Apps : </w:t>
+      </w:r>
+      <w:hyperlink r:id="rId7">
+        <w:r>
+          <w:rPr>
+            <w:color w:val="auto"/>
+            <w:sz w:val="19"/>
+            <w:szCs w:val="19"/>
+          </w:rPr>
+          <w:t>apps.odoo.com</w:t>
         </w:r>
       </w:hyperlink>
       <w:r>
         <w:rPr>
-          <w:color w:val="C8DCF0"/>
+          <w:color w:val="auto"/>
           <w:sz w:val="19"/>
           <w:szCs w:val="19"/>
         </w:rPr>
@@ -3082,7 +3792,7 @@
 </file>
 
 <file path=word/numbering.xml><?xml version="1.0" encoding="utf-8"?>
-<w:numbering xmlns:wpc="http://schemas.microsoft.com/office/word/2010/wordprocessingCanvas" xmlns:cx="http://schemas.microsoft.com/office/drawing/2014/chartex" xmlns:cx1="http://schemas.microsoft.com/office/drawing/2015/9/8/chartex" xmlns:cx2="http://schemas.microsoft.com/office/drawing/2015/10/21/chartex" xmlns:cx3="http://schemas.microsoft.com/office/drawing/2016/5/9/chartex" xmlns:cx4="http://schemas.microsoft.com/office/drawing/2016/5/10/chartex" xmlns:cx5="http://schemas.microsoft.com/office/drawing/2016/5/11/chartex" xmlns:cx6="http://schemas.microsoft.com/office/drawing/2016/5/12/chartex" xmlns:cx7="http://schemas.microsoft.com/office/drawing/2016/5/13/chartex" xmlns:cx8="http://schemas.microsoft.com/office/drawing/2016/5/14/chartex" xmlns:mc="http://schemas.openxmlformats.org/markup-compatibility/2006" xmlns:aink="http://schemas.microsoft.com/office/drawing/2016/ink" xmlns:am3d="http://schemas.microsoft.com/office/drawing/2017/model3d" xmlns:o="urn:schemas-microsoft-com:office:office" xmlns:oel="http://schemas.microsoft.com/office/2019/extlst" xmlns:r="http://schemas.openxmlformats.org/officeDocument/2006/relationships" xmlns:m="http://schemas.openxmlformats.org/officeDocument/2006/math" xmlns:v="urn:schemas-microsoft-com:vml" xmlns:wp14="http://schemas.microsoft.com/office/word/2010/wordprocessingDrawing" xmlns:wp="http://schemas.openxmlformats.org/drawingml/2006/wordprocessingDrawing" xmlns:w10="urn:schemas-microsoft-com:office:word" xmlns:w="http://schemas.openxmlformats.org/wordprocessingml/2006/main" xmlns:w14="http://schemas.microsoft.com/office/word/2010/wordml" xmlns:w15="http://schemas.microsoft.com/office/word/2012/wordml" xmlns:w16cex="http://schemas.microsoft.com/office/word/2018/wordml/cex" xmlns:w16cid="http://schemas.microsoft.com/office/word/2016/wordml/cid" xmlns:w16="http://schemas.microsoft.com/office/word/2018/wordml" xmlns:w16du="http://schemas.microsoft.com/office/word/2023/wordml/word16du" xmlns:w16sdtdh="http://schemas.microsoft.com/office/word/2020/wordml/sdtdatahash" xmlns:w16sdtfl="http://schemas.microsoft.com/office/word/2024/wordml/sdtformatlock" xmlns:w16se="http://schemas.microsoft.com/office/word/2015/wordml/symex" xmlns:wpg="http://schemas.microsoft.com/office/word/2010/wordprocessingGroup" xmlns:wpi="http://schemas.microsoft.com/office/word/2010/wordprocessingInk" xmlns:wne="http://schemas.microsoft.com/office/word/2006/wordml" xmlns:wps="http://schemas.microsoft.com/office/word/2010/wordprocessingShape" mc:Ignorable="w14 w15 w16se w16cid w16 w16cex w16sdtdh w16sdtfl w16du wp14">
+<w:numbering xmlns:wpc="http://schemas.microsoft.com/office/word/2010/wordprocessingCanvas" xmlns:cx="http://schemas.microsoft.com/office/drawing/2014/chartex" xmlns:cx1="http://schemas.microsoft.com/office/drawing/2015/9/8/chartex" xmlns:cx2="http://schemas.microsoft.com/office/drawing/2015/10/21/chartex" xmlns:cx3="http://schemas.microsoft.com/office/drawing/2016/5/9/chartex" xmlns:cx4="http://schemas.microsoft.com/office/drawing/2016/5/10/chartex" xmlns:cx5="http://schemas.microsoft.com/office/drawing/2016/5/11/chartex" xmlns:cx6="http://schemas.microsoft.com/office/drawing/2016/5/12/chartex" xmlns:cx7="http://schemas.microsoft.com/office/drawing/2016/5/13/chartex" xmlns:cx8="http://schemas.microsoft.com/office/drawing/2016/5/14/chartex" xmlns:mc="http://schemas.openxmlformats.org/markup-compatibility/2006" xmlns:aink="http://schemas.microsoft.com/office/drawing/2016/ink" xmlns:am3d="http://schemas.microsoft.com/office/drawing/2017/model3d" xmlns:o="urn:schemas-microsoft-com:office:office" xmlns:oel="http://schemas.microsoft.com/office/2019/extlst" xmlns:r="http://schemas.openxmlformats.org/officeDocument/2006/relationships" xmlns:m="http://schemas.openxmlformats.org/officeDocument/2006/math" xmlns:v="urn:schemas-microsoft-com:vml" xmlns:wp14="http://schemas.microsoft.com/office/word/2010/wordprocessingDrawing" xmlns:wp="http://schemas.openxmlformats.org/drawingml/2006/wordprocessingDrawing" xmlns:w10="urn:schemas-microsoft-com:office:word" xmlns:w="http://schemas.openxmlformats.org/wordprocessingml/2006/main" xmlns:w14="http://schemas.microsoft.com/office/word/2010/wordml" xmlns:w15="http://schemas.microsoft.com/office/word/2012/wordml" xmlns:w16cei="http://schemas.microsoft.com/office/word/2026/wordml/cei" xmlns:w16cex="http://schemas.microsoft.com/office/word/2018/wordml/cex" xmlns:w16cid="http://schemas.microsoft.com/office/word/2016/wordml/cid" xmlns:w16="http://schemas.microsoft.com/office/word/2018/wordml" xmlns:w16du="http://schemas.microsoft.com/office/word/2023/wordml/word16du" xmlns:w16sdtdh="http://schemas.microsoft.com/office/word/2020/wordml/sdtdatahash" xmlns:w16sdtfl="http://schemas.microsoft.com/office/word/2024/wordml/sdtformatlock" xmlns:w16se="http://schemas.microsoft.com/office/word/2015/wordml/symex" xmlns:wpg="http://schemas.microsoft.com/office/word/2010/wordprocessingGroup" xmlns:wpi="http://schemas.microsoft.com/office/word/2010/wordprocessingInk" xmlns:wne="http://schemas.microsoft.com/office/word/2006/wordml" xmlns:wps="http://schemas.microsoft.com/office/word/2010/wordprocessingShape" mc:Ignorable="w14 w15 w16se w16cid w16 w16cex w16sdtdh w16sdtfl w16du wp14">
   <w:abstractNum w:abstractNumId="0" w15:restartNumberingAfterBreak="0">
     <w:nsid w:val="7D686578"/>
     <w:multiLevelType w:val="hybridMultilevel"/>

</xml_diff>